<commit_message>
Actualización de Estudio Técnico
</commit_message>
<xml_diff>
--- a/Estudio_Tecnico.docx
+++ b/Estudio_Tecnico.docx
@@ -4,6 +4,7 @@
   <w:body>
     <w:p>
       <w:pPr>
+        <w:spacing w:line="276" w:lineRule="auto"/>
         <w:jc w:val="center"/>
         <w:rPr>
           <w:rFonts w:ascii="Times New Roman" w:hAnsi="Times New Roman" w:cs="Times New Roman"/>
@@ -203,6 +204,7 @@
     </w:p>
     <w:p>
       <w:pPr>
+        <w:spacing w:line="276" w:lineRule="auto"/>
         <w:jc w:val="center"/>
         <w:rPr>
           <w:rFonts w:ascii="Times New Roman" w:hAnsi="Times New Roman" w:cs="Times New Roman"/>
@@ -213,6 +215,7 @@
     </w:p>
     <w:p>
       <w:pPr>
+        <w:spacing w:line="276" w:lineRule="auto"/>
         <w:jc w:val="center"/>
         <w:rPr>
           <w:rFonts w:ascii="Times New Roman" w:hAnsi="Times New Roman" w:cs="Times New Roman"/>
@@ -223,6 +226,7 @@
     </w:p>
     <w:p>
       <w:pPr>
+        <w:spacing w:line="276" w:lineRule="auto"/>
         <w:jc w:val="center"/>
         <w:rPr>
           <w:rFonts w:ascii="Times New Roman" w:hAnsi="Times New Roman" w:cs="Times New Roman"/>
@@ -245,6 +249,7 @@
     </w:p>
     <w:p>
       <w:pPr>
+        <w:spacing w:line="276" w:lineRule="auto"/>
         <w:jc w:val="center"/>
         <w:rPr>
           <w:rFonts w:ascii="Times New Roman" w:hAnsi="Times New Roman" w:cs="Times New Roman"/>
@@ -267,6 +272,7 @@
     </w:p>
     <w:p>
       <w:pPr>
+        <w:spacing w:line="276" w:lineRule="auto"/>
         <w:jc w:val="center"/>
         <w:rPr>
           <w:rFonts w:ascii="Times New Roman" w:hAnsi="Times New Roman" w:cs="Times New Roman"/>
@@ -279,6 +285,7 @@
     </w:p>
     <w:p>
       <w:pPr>
+        <w:spacing w:line="276" w:lineRule="auto"/>
         <w:jc w:val="center"/>
         <w:rPr>
           <w:rFonts w:ascii="Times New Roman" w:hAnsi="Times New Roman" w:cs="Times New Roman"/>
@@ -301,6 +308,7 @@
     </w:p>
     <w:p>
       <w:pPr>
+        <w:spacing w:line="276" w:lineRule="auto"/>
         <w:jc w:val="center"/>
         <w:rPr>
           <w:rFonts w:ascii="Times New Roman" w:hAnsi="Times New Roman" w:cs="Times New Roman"/>
@@ -319,6 +327,7 @@
     </w:p>
     <w:p>
       <w:pPr>
+        <w:spacing w:line="276" w:lineRule="auto"/>
         <w:jc w:val="center"/>
         <w:rPr>
           <w:rFonts w:ascii="Times New Roman" w:hAnsi="Times New Roman" w:cs="Times New Roman"/>
@@ -329,6 +338,7 @@
     </w:p>
     <w:p>
       <w:pPr>
+        <w:spacing w:line="276" w:lineRule="auto"/>
         <w:jc w:val="center"/>
         <w:rPr>
           <w:rFonts w:ascii="Times New Roman" w:hAnsi="Times New Roman" w:cs="Times New Roman"/>
@@ -347,6 +357,7 @@
     </w:p>
     <w:p>
       <w:pPr>
+        <w:spacing w:line="276" w:lineRule="auto"/>
         <w:jc w:val="center"/>
         <w:rPr>
           <w:rFonts w:ascii="Times New Roman" w:hAnsi="Times New Roman" w:cs="Times New Roman"/>
@@ -384,23 +395,12 @@
           <w:sz w:val="32"/>
           <w:szCs w:val="32"/>
         </w:rPr>
-        <w:t xml:space="preserve">Patricia Rodríguez </w:t>
-      </w:r>
-      <w:proofErr w:type="spellStart"/>
-      <w:r>
-        <w:rPr>
-          <w:rFonts w:ascii="Times New Roman" w:hAnsi="Times New Roman" w:cs="Times New Roman"/>
-          <w:i/>
-          <w:iCs/>
-          <w:sz w:val="32"/>
-          <w:szCs w:val="32"/>
-        </w:rPr>
-        <w:t>Veyna</w:t>
-      </w:r>
-      <w:proofErr w:type="spellEnd"/>
-    </w:p>
-    <w:p>
-      <w:pPr>
+        <w:t>Patricia Rodríguez Veyna</w:t>
+      </w:r>
+    </w:p>
+    <w:p>
+      <w:pPr>
+        <w:spacing w:line="276" w:lineRule="auto"/>
         <w:jc w:val="center"/>
         <w:rPr>
           <w:rFonts w:ascii="Times New Roman" w:hAnsi="Times New Roman" w:cs="Times New Roman"/>
@@ -411,6 +411,7 @@
     </w:p>
     <w:p>
       <w:pPr>
+        <w:spacing w:line="276" w:lineRule="auto"/>
         <w:jc w:val="center"/>
         <w:rPr>
           <w:rFonts w:ascii="Times New Roman" w:hAnsi="Times New Roman" w:cs="Times New Roman"/>
@@ -433,6 +434,7 @@
     </w:p>
     <w:p>
       <w:pPr>
+        <w:spacing w:line="276" w:lineRule="auto"/>
         <w:jc w:val="center"/>
         <w:rPr>
           <w:rFonts w:ascii="Times New Roman" w:hAnsi="Times New Roman" w:cs="Times New Roman"/>
@@ -445,6 +447,7 @@
     </w:p>
     <w:p>
       <w:pPr>
+        <w:spacing w:line="276" w:lineRule="auto"/>
         <w:jc w:val="center"/>
         <w:rPr>
           <w:rFonts w:ascii="Times New Roman" w:hAnsi="Times New Roman" w:cs="Times New Roman"/>
@@ -468,6 +471,7 @@
           <w:ilvl w:val="0"/>
           <w:numId w:val="1"/>
         </w:numPr>
+        <w:spacing w:line="276" w:lineRule="auto"/>
         <w:jc w:val="center"/>
         <w:rPr>
           <w:rFonts w:ascii="Times New Roman" w:hAnsi="Times New Roman" w:cs="Times New Roman"/>
@@ -491,6 +495,7 @@
           <w:ilvl w:val="0"/>
           <w:numId w:val="1"/>
         </w:numPr>
+        <w:spacing w:line="276" w:lineRule="auto"/>
         <w:jc w:val="center"/>
         <w:rPr>
           <w:rFonts w:ascii="Times New Roman" w:hAnsi="Times New Roman" w:cs="Times New Roman"/>
@@ -514,6 +519,7 @@
           <w:ilvl w:val="0"/>
           <w:numId w:val="1"/>
         </w:numPr>
+        <w:spacing w:line="276" w:lineRule="auto"/>
         <w:jc w:val="center"/>
         <w:rPr>
           <w:rFonts w:ascii="Times New Roman" w:hAnsi="Times New Roman" w:cs="Times New Roman"/>
@@ -527,11 +533,12 @@
           <w:sz w:val="32"/>
           <w:szCs w:val="32"/>
         </w:rPr>
-        <w:t>Paco</w:t>
-      </w:r>
-    </w:p>
-    <w:p>
-      <w:pPr>
+        <w:t>Torres Hernández Luis Francisco</w:t>
+      </w:r>
+    </w:p>
+    <w:p>
+      <w:pPr>
+        <w:spacing w:line="276" w:lineRule="auto"/>
         <w:jc w:val="center"/>
         <w:rPr>
           <w:rFonts w:ascii="Times New Roman" w:hAnsi="Times New Roman" w:cs="Times New Roman"/>
@@ -542,6 +549,7 @@
     </w:p>
     <w:p>
       <w:pPr>
+        <w:spacing w:line="276" w:lineRule="auto"/>
         <w:jc w:val="center"/>
         <w:rPr>
           <w:rFonts w:ascii="Times New Roman" w:hAnsi="Times New Roman" w:cs="Times New Roman"/>
@@ -570,6 +578,7 @@
     </w:p>
     <w:p>
       <w:pPr>
+        <w:spacing w:line="360" w:lineRule="auto"/>
         <w:jc w:val="center"/>
         <w:rPr>
           <w:rFonts w:ascii="Times New Roman" w:hAnsi="Times New Roman" w:cs="Times New Roman"/>
@@ -580,6 +589,7 @@
     </w:p>
     <w:p>
       <w:pPr>
+        <w:spacing w:line="360" w:lineRule="auto"/>
         <w:jc w:val="both"/>
         <w:rPr>
           <w:rFonts w:ascii="Times New Roman" w:hAnsi="Times New Roman" w:cs="Times New Roman"/>
@@ -595,6 +605,7 @@
           <w:ilvl w:val="0"/>
           <w:numId w:val="3"/>
         </w:numPr>
+        <w:spacing w:line="360" w:lineRule="auto"/>
         <w:jc w:val="both"/>
         <w:rPr>
           <w:rFonts w:ascii="Times New Roman" w:hAnsi="Times New Roman" w:cs="Times New Roman"/>
@@ -614,6 +625,7 @@
     </w:p>
     <w:p>
       <w:pPr>
+        <w:spacing w:line="360" w:lineRule="auto"/>
         <w:ind w:left="360"/>
         <w:jc w:val="both"/>
         <w:rPr>
@@ -629,6 +641,7 @@
     </w:p>
     <w:p>
       <w:pPr>
+        <w:spacing w:line="360" w:lineRule="auto"/>
         <w:ind w:left="360"/>
         <w:jc w:val="both"/>
         <w:rPr>
@@ -639,25 +652,12 @@
         <w:rPr>
           <w:rFonts w:ascii="Times New Roman" w:hAnsi="Times New Roman" w:cs="Times New Roman"/>
         </w:rPr>
-        <w:t xml:space="preserve">En este contexto, el proyecto “Digital </w:t>
-      </w:r>
-      <w:proofErr w:type="spellStart"/>
-      <w:r>
-        <w:rPr>
-          <w:rFonts w:ascii="Times New Roman" w:hAnsi="Times New Roman" w:cs="Times New Roman"/>
-        </w:rPr>
-        <w:t>Vision</w:t>
-      </w:r>
-      <w:proofErr w:type="spellEnd"/>
-      <w:r>
-        <w:rPr>
-          <w:rFonts w:ascii="Times New Roman" w:hAnsi="Times New Roman" w:cs="Times New Roman"/>
-        </w:rPr>
-        <w:t>” tiene como objetivo principal atender esta necesidad mediante la oferta de servicios de impresión de alta calidad, así como el desarrollo de contenido gráfico personalizado. Estos servicios estarán orientados a satisfacer las demandas tanto de clientes individuales como del sector corporativo, garantizando soluciones visuales efectivas, creativas y adaptadas a cada necesidad.</w:t>
-      </w:r>
-    </w:p>
-    <w:p>
-      <w:pPr>
+        <w:t>En este contexto, el proyecto “Digital Vision” tiene como objetivo principal atender esta necesidad mediante la oferta de servicios de impresión de alta calidad, así como el desarrollo de contenido gráfico personalizado. Estos servicios estarán orientados a satisfacer las demandas tanto de clientes individuales como del sector corporativo, garantizando soluciones visuales efectivas, creativas y adaptadas a cada necesidad.</w:t>
+      </w:r>
+    </w:p>
+    <w:p>
+      <w:pPr>
+        <w:spacing w:line="360" w:lineRule="auto"/>
         <w:ind w:left="360"/>
         <w:jc w:val="both"/>
         <w:rPr>
@@ -672,6 +672,7 @@
           <w:ilvl w:val="0"/>
           <w:numId w:val="3"/>
         </w:numPr>
+        <w:spacing w:line="360" w:lineRule="auto"/>
         <w:jc w:val="both"/>
         <w:rPr>
           <w:rFonts w:ascii="Times New Roman" w:hAnsi="Times New Roman" w:cs="Times New Roman"/>
@@ -690,6 +691,7 @@
     </w:p>
     <w:p>
       <w:pPr>
+        <w:spacing w:line="360" w:lineRule="auto"/>
         <w:ind w:left="360"/>
         <w:jc w:val="both"/>
         <w:rPr>
@@ -706,21 +708,7 @@
         <w:rPr>
           <w:rFonts w:ascii="Times New Roman" w:hAnsi="Times New Roman" w:cs="Times New Roman"/>
         </w:rPr>
-        <w:t xml:space="preserve">creación del proyecto “Digital </w:t>
-      </w:r>
-      <w:proofErr w:type="spellStart"/>
-      <w:r>
-        <w:rPr>
-          <w:rFonts w:ascii="Times New Roman" w:hAnsi="Times New Roman" w:cs="Times New Roman"/>
-        </w:rPr>
-        <w:t>Vision</w:t>
-      </w:r>
-      <w:proofErr w:type="spellEnd"/>
-      <w:r>
-        <w:rPr>
-          <w:rFonts w:ascii="Times New Roman" w:hAnsi="Times New Roman" w:cs="Times New Roman"/>
-        </w:rPr>
-        <w:t>”:</w:t>
+        <w:t>creación del proyecto “Digital Vision”:</w:t>
       </w:r>
     </w:p>
     <w:p>
@@ -730,6 +718,7 @@
           <w:ilvl w:val="0"/>
           <w:numId w:val="6"/>
         </w:numPr>
+        <w:spacing w:line="360" w:lineRule="auto"/>
         <w:jc w:val="both"/>
         <w:rPr>
           <w:rFonts w:ascii="Times New Roman" w:hAnsi="Times New Roman" w:cs="Times New Roman"/>
@@ -739,7 +728,7 @@
         <w:rPr>
           <w:rFonts w:ascii="Times New Roman" w:hAnsi="Times New Roman" w:cs="Times New Roman"/>
         </w:rPr>
-        <w:t>Tamaño de la planta.</w:t>
+        <w:t>Identificar los medios de promoción.</w:t>
       </w:r>
     </w:p>
     <w:p>
@@ -749,6 +738,7 @@
           <w:ilvl w:val="0"/>
           <w:numId w:val="6"/>
         </w:numPr>
+        <w:spacing w:line="360" w:lineRule="auto"/>
         <w:jc w:val="both"/>
         <w:rPr>
           <w:rFonts w:ascii="Times New Roman" w:hAnsi="Times New Roman" w:cs="Times New Roman"/>
@@ -758,7 +748,7 @@
         <w:rPr>
           <w:rFonts w:ascii="Times New Roman" w:hAnsi="Times New Roman" w:cs="Times New Roman"/>
         </w:rPr>
-        <w:t>Localización de la planta.</w:t>
+        <w:t>Definir dónde se ubicará la empresa.</w:t>
       </w:r>
     </w:p>
     <w:p>
@@ -768,11 +758,498 @@
           <w:ilvl w:val="0"/>
           <w:numId w:val="6"/>
         </w:numPr>
+        <w:spacing w:line="360" w:lineRule="auto"/>
         <w:jc w:val="both"/>
         <w:rPr>
           <w:rFonts w:ascii="Times New Roman" w:hAnsi="Times New Roman" w:cs="Times New Roman"/>
         </w:rPr>
       </w:pPr>
+      <w:r>
+        <w:rPr>
+          <w:rFonts w:ascii="Times New Roman" w:hAnsi="Times New Roman" w:cs="Times New Roman"/>
+        </w:rPr>
+        <w:t>Tamaño de la empresa</w:t>
+      </w:r>
+      <w:r>
+        <w:rPr>
+          <w:rFonts w:ascii="Times New Roman" w:hAnsi="Times New Roman" w:cs="Times New Roman"/>
+        </w:rPr>
+        <w:t xml:space="preserve"> y adecuaciones</w:t>
+      </w:r>
+      <w:r>
+        <w:rPr>
+          <w:rFonts w:ascii="Times New Roman" w:hAnsi="Times New Roman" w:cs="Times New Roman"/>
+        </w:rPr>
+        <w:t>.</w:t>
+      </w:r>
+    </w:p>
+    <w:p>
+      <w:pPr>
+        <w:pStyle w:val="Prrafodelista"/>
+        <w:numPr>
+          <w:ilvl w:val="0"/>
+          <w:numId w:val="6"/>
+        </w:numPr>
+        <w:spacing w:line="360" w:lineRule="auto"/>
+        <w:jc w:val="both"/>
+        <w:rPr>
+          <w:rFonts w:ascii="Times New Roman" w:hAnsi="Times New Roman" w:cs="Times New Roman"/>
+        </w:rPr>
+      </w:pPr>
+      <w:r>
+        <w:rPr>
+          <w:rFonts w:ascii="Times New Roman" w:hAnsi="Times New Roman" w:cs="Times New Roman"/>
+        </w:rPr>
+        <w:t>Definición de que máquinas y equipo a usar.</w:t>
+      </w:r>
+    </w:p>
+    <w:p>
+      <w:pPr>
+        <w:pStyle w:val="Prrafodelista"/>
+        <w:numPr>
+          <w:ilvl w:val="0"/>
+          <w:numId w:val="6"/>
+        </w:numPr>
+        <w:spacing w:line="360" w:lineRule="auto"/>
+        <w:jc w:val="both"/>
+        <w:rPr>
+          <w:rFonts w:ascii="Times New Roman" w:hAnsi="Times New Roman" w:cs="Times New Roman"/>
+        </w:rPr>
+      </w:pPr>
+      <w:r>
+        <w:rPr>
+          <w:rFonts w:ascii="Times New Roman" w:hAnsi="Times New Roman" w:cs="Times New Roman"/>
+        </w:rPr>
+        <w:t>Personal necesario para llevar a cabo este proyecto.</w:t>
+      </w:r>
+    </w:p>
+    <w:p>
+      <w:pPr>
+        <w:spacing w:line="360" w:lineRule="auto"/>
+        <w:jc w:val="both"/>
+        <w:rPr>
+          <w:rFonts w:ascii="Times New Roman" w:hAnsi="Times New Roman" w:cs="Times New Roman"/>
+        </w:rPr>
+      </w:pPr>
+    </w:p>
+    <w:p>
+      <w:pPr>
+        <w:pStyle w:val="Prrafodelista"/>
+        <w:numPr>
+          <w:ilvl w:val="0"/>
+          <w:numId w:val="3"/>
+        </w:numPr>
+        <w:spacing w:line="360" w:lineRule="auto"/>
+        <w:jc w:val="both"/>
+        <w:rPr>
+          <w:rFonts w:ascii="Times New Roman" w:hAnsi="Times New Roman" w:cs="Times New Roman"/>
+          <w:b/>
+          <w:bCs/>
+        </w:rPr>
+      </w:pPr>
+      <w:r>
+        <w:rPr>
+          <w:rFonts w:ascii="Times New Roman" w:hAnsi="Times New Roman" w:cs="Times New Roman"/>
+          <w:b/>
+          <w:bCs/>
+        </w:rPr>
+        <w:t>Definición y justificación del problema</w:t>
+      </w:r>
+    </w:p>
+    <w:p>
+      <w:pPr>
+        <w:pStyle w:val="Prrafodelista"/>
+        <w:numPr>
+          <w:ilvl w:val="1"/>
+          <w:numId w:val="3"/>
+        </w:numPr>
+        <w:spacing w:line="360" w:lineRule="auto"/>
+        <w:jc w:val="both"/>
+        <w:rPr>
+          <w:rFonts w:ascii="Times New Roman" w:hAnsi="Times New Roman" w:cs="Times New Roman"/>
+          <w:b/>
+          <w:bCs/>
+        </w:rPr>
+      </w:pPr>
+      <w:r>
+        <w:rPr>
+          <w:rFonts w:ascii="Times New Roman" w:hAnsi="Times New Roman" w:cs="Times New Roman"/>
+          <w:b/>
+          <w:bCs/>
+        </w:rPr>
+        <w:t xml:space="preserve"> Planteamiento del problema</w:t>
+      </w:r>
+    </w:p>
+    <w:p>
+      <w:pPr>
+        <w:spacing w:line="360" w:lineRule="auto"/>
+        <w:ind w:left="360"/>
+        <w:jc w:val="both"/>
+        <w:rPr>
+          <w:rFonts w:ascii="Times New Roman" w:hAnsi="Times New Roman" w:cs="Times New Roman"/>
+        </w:rPr>
+      </w:pPr>
+      <w:r>
+        <w:rPr>
+          <w:rFonts w:ascii="Times New Roman" w:hAnsi="Times New Roman" w:cs="Times New Roman"/>
+        </w:rPr>
+        <w:t xml:space="preserve">El problema principal </w:t>
+      </w:r>
+      <w:r>
+        <w:rPr>
+          <w:rFonts w:ascii="Times New Roman" w:hAnsi="Times New Roman" w:cs="Times New Roman"/>
+        </w:rPr>
+        <w:t xml:space="preserve">en el que se basa este estudio es la necesidad de ofrecer servicios de impresión y diseño gráfico mediante procesos, equipo especializado y flujos de trabajo, que permitan garantizar productos de calidad y satisfacer las exigencias del cliente, ya que actualmente una gran parte del público en general, y en especial la comunidad estudiantil, no </w:t>
+      </w:r>
+      <w:r>
+        <w:rPr>
+          <w:rFonts w:ascii="Times New Roman" w:hAnsi="Times New Roman" w:cs="Times New Roman"/>
+        </w:rPr>
+        <w:lastRenderedPageBreak/>
+        <w:t>cuenta con acceso a servicios integrales que combinen rapidez, buena presentación y asesoría profesional en un mismo lugar.</w:t>
+      </w:r>
+    </w:p>
+    <w:p>
+      <w:pPr>
+        <w:spacing w:line="360" w:lineRule="auto"/>
+        <w:ind w:left="360"/>
+        <w:jc w:val="both"/>
+        <w:rPr>
+          <w:rFonts w:ascii="Times New Roman" w:hAnsi="Times New Roman" w:cs="Times New Roman"/>
+        </w:rPr>
+      </w:pPr>
+      <w:r>
+        <w:rPr>
+          <w:rFonts w:ascii="Times New Roman" w:hAnsi="Times New Roman" w:cs="Times New Roman"/>
+        </w:rPr>
+        <w:t>Asimismo, la implementación de servicios organizados y accesibles puede ayudar a optimizar recursos, reducir errores en impresión y mejorar los tiempos de entrega, lo cual representa una ventaja importante para los usuarios que requieren soluciones rápidas y eficientes. De esta manera, el proyecto busca posicionarse como una alternativa que integre calidad, accesibilidad y creatividad en el ámbito de la impresión y el diseño gráfico.</w:t>
+      </w:r>
+    </w:p>
+    <w:p>
+      <w:pPr>
+        <w:spacing w:line="360" w:lineRule="auto"/>
+        <w:ind w:left="360"/>
+        <w:jc w:val="both"/>
+        <w:rPr>
+          <w:rFonts w:ascii="Times New Roman" w:hAnsi="Times New Roman" w:cs="Times New Roman"/>
+        </w:rPr>
+      </w:pPr>
+    </w:p>
+    <w:p>
+      <w:pPr>
+        <w:pStyle w:val="Prrafodelista"/>
+        <w:numPr>
+          <w:ilvl w:val="1"/>
+          <w:numId w:val="3"/>
+        </w:numPr>
+        <w:spacing w:line="360" w:lineRule="auto"/>
+        <w:jc w:val="both"/>
+        <w:rPr>
+          <w:rFonts w:ascii="Times New Roman" w:hAnsi="Times New Roman" w:cs="Times New Roman"/>
+          <w:b/>
+          <w:bCs/>
+        </w:rPr>
+      </w:pPr>
+      <w:r>
+        <w:rPr>
+          <w:rFonts w:ascii="Times New Roman" w:hAnsi="Times New Roman" w:cs="Times New Roman"/>
+          <w:b/>
+          <w:bCs/>
+        </w:rPr>
+        <w:t xml:space="preserve"> Justificación</w:t>
+      </w:r>
+    </w:p>
+    <w:p>
+      <w:pPr>
+        <w:spacing w:line="360" w:lineRule="auto"/>
+        <w:ind w:left="360"/>
+        <w:jc w:val="both"/>
+        <w:rPr>
+          <w:rFonts w:ascii="Times New Roman" w:hAnsi="Times New Roman" w:cs="Times New Roman"/>
+        </w:rPr>
+      </w:pPr>
+      <w:r>
+        <w:rPr>
+          <w:rFonts w:ascii="Times New Roman" w:hAnsi="Times New Roman" w:cs="Times New Roman"/>
+        </w:rPr>
+        <w:t>Actualmente, la ausencia de un establecimiento que ofrezca estos servicios en el área planteada dificulta el acceso a soluciones que permitan desarrollar materiales visuales adecuados y profesionales.</w:t>
+      </w:r>
+    </w:p>
+    <w:p>
+      <w:pPr>
+        <w:spacing w:line="360" w:lineRule="auto"/>
+        <w:ind w:left="360"/>
+        <w:jc w:val="both"/>
+        <w:rPr>
+          <w:rFonts w:ascii="Times New Roman" w:hAnsi="Times New Roman" w:cs="Times New Roman"/>
+        </w:rPr>
+      </w:pPr>
+      <w:r>
+        <w:rPr>
+          <w:rFonts w:ascii="Times New Roman" w:hAnsi="Times New Roman" w:cs="Times New Roman"/>
+        </w:rPr>
+        <w:t>Este proyecto representa una oportunidad para cubrir dicha necesidad, al integrar en un solo lugar servicios de impresión y diseño gráfico, lo que facilitará la elaboración de trabajos académicos, proyectos y materiales publicitarios con mejor presentación y calidad. En particular, los servicios de diseño gráfico permiten estructurar y comunicar ideas de manera clara y atractiva, fortaleciendo la imagen visual de los usuarios.</w:t>
+      </w:r>
+    </w:p>
+    <w:p>
+      <w:pPr>
+        <w:spacing w:line="360" w:lineRule="auto"/>
+        <w:ind w:left="360"/>
+        <w:jc w:val="both"/>
+        <w:rPr>
+          <w:rFonts w:ascii="Times New Roman" w:hAnsi="Times New Roman" w:cs="Times New Roman"/>
+        </w:rPr>
+      </w:pPr>
+      <w:r>
+        <w:rPr>
+          <w:rFonts w:ascii="Times New Roman" w:hAnsi="Times New Roman" w:cs="Times New Roman"/>
+        </w:rPr>
+        <w:t>La ubicación dentro de un entorno educativo favorece el acceso inmediato, la optimización del tiempo y la reducción de costos, aspectos clave para estudiantes que requieren soluciones rápidas y eficientes. De esta manera, el proyecto contribuye a mejorar la comunicación visual y la presentación profesional de ideas</w:t>
+      </w:r>
+      <w:r>
+        <w:rPr>
+          <w:rFonts w:ascii="Times New Roman" w:hAnsi="Times New Roman" w:cs="Times New Roman"/>
+        </w:rPr>
+        <w:t>.</w:t>
+      </w:r>
+    </w:p>
+    <w:p>
+      <w:pPr>
+        <w:spacing w:line="360" w:lineRule="auto"/>
+        <w:ind w:left="360"/>
+        <w:jc w:val="both"/>
+        <w:rPr>
+          <w:rFonts w:ascii="Times New Roman" w:hAnsi="Times New Roman" w:cs="Times New Roman"/>
+        </w:rPr>
+      </w:pPr>
+    </w:p>
+    <w:p>
+      <w:pPr>
+        <w:pStyle w:val="Prrafodelista"/>
+        <w:numPr>
+          <w:ilvl w:val="0"/>
+          <w:numId w:val="3"/>
+        </w:numPr>
+        <w:spacing w:line="360" w:lineRule="auto"/>
+        <w:jc w:val="both"/>
+        <w:rPr>
+          <w:rFonts w:ascii="Times New Roman" w:hAnsi="Times New Roman" w:cs="Times New Roman"/>
+          <w:b/>
+          <w:bCs/>
+        </w:rPr>
+      </w:pPr>
+      <w:r>
+        <w:rPr>
+          <w:rFonts w:ascii="Times New Roman" w:hAnsi="Times New Roman" w:cs="Times New Roman"/>
+          <w:b/>
+          <w:bCs/>
+        </w:rPr>
+        <w:t>Objetivos</w:t>
+      </w:r>
+    </w:p>
+    <w:p>
+      <w:pPr>
+        <w:pStyle w:val="Prrafodelista"/>
+        <w:numPr>
+          <w:ilvl w:val="1"/>
+          <w:numId w:val="3"/>
+        </w:numPr>
+        <w:spacing w:line="360" w:lineRule="auto"/>
+        <w:jc w:val="both"/>
+        <w:rPr>
+          <w:rFonts w:ascii="Times New Roman" w:hAnsi="Times New Roman" w:cs="Times New Roman"/>
+          <w:b/>
+          <w:bCs/>
+        </w:rPr>
+      </w:pPr>
+      <w:r>
+        <w:rPr>
+          <w:rFonts w:ascii="Times New Roman" w:hAnsi="Times New Roman" w:cs="Times New Roman"/>
+          <w:b/>
+          <w:bCs/>
+        </w:rPr>
+        <w:t xml:space="preserve"> Objetivos generales del estudio</w:t>
+      </w:r>
+    </w:p>
+    <w:p>
+      <w:pPr>
+        <w:spacing w:line="360" w:lineRule="auto"/>
+        <w:ind w:left="360"/>
+        <w:jc w:val="both"/>
+        <w:rPr>
+          <w:rFonts w:ascii="Times New Roman" w:hAnsi="Times New Roman" w:cs="Times New Roman"/>
+        </w:rPr>
+      </w:pPr>
+      <w:r>
+        <w:rPr>
+          <w:rFonts w:ascii="Times New Roman" w:hAnsi="Times New Roman" w:cs="Times New Roman"/>
+        </w:rPr>
+        <w:t>Desarrollar un estudio técnico que pueda determinar la viabilidad de llevar a cabo la consolidación del proyecto Digital Vision</w:t>
+      </w:r>
+      <w:r>
+        <w:rPr>
+          <w:rFonts w:ascii="Times New Roman" w:hAnsi="Times New Roman" w:cs="Times New Roman"/>
+        </w:rPr>
+        <w:t xml:space="preserve"> como una empresa de imprenta y diseño gráfico de grado profesional.</w:t>
+      </w:r>
+    </w:p>
+    <w:p>
+      <w:pPr>
+        <w:pStyle w:val="Prrafodelista"/>
+        <w:numPr>
+          <w:ilvl w:val="1"/>
+          <w:numId w:val="3"/>
+        </w:numPr>
+        <w:spacing w:line="360" w:lineRule="auto"/>
+        <w:jc w:val="both"/>
+        <w:rPr>
+          <w:rFonts w:ascii="Times New Roman" w:hAnsi="Times New Roman" w:cs="Times New Roman"/>
+          <w:b/>
+          <w:bCs/>
+        </w:rPr>
+      </w:pPr>
+      <w:r>
+        <w:rPr>
+          <w:rFonts w:ascii="Times New Roman" w:hAnsi="Times New Roman" w:cs="Times New Roman"/>
+          <w:b/>
+          <w:bCs/>
+        </w:rPr>
+        <w:lastRenderedPageBreak/>
+        <w:t xml:space="preserve"> Objetivos específicos</w:t>
+      </w:r>
+    </w:p>
+    <w:p>
+      <w:pPr>
+        <w:pStyle w:val="Prrafodelista"/>
+        <w:numPr>
+          <w:ilvl w:val="0"/>
+          <w:numId w:val="7"/>
+        </w:numPr>
+        <w:spacing w:line="360" w:lineRule="auto"/>
+        <w:jc w:val="both"/>
+        <w:rPr>
+          <w:rFonts w:ascii="Times New Roman" w:hAnsi="Times New Roman" w:cs="Times New Roman"/>
+        </w:rPr>
+      </w:pPr>
+      <w:r>
+        <w:rPr>
+          <w:rFonts w:ascii="Times New Roman" w:hAnsi="Times New Roman" w:cs="Times New Roman"/>
+        </w:rPr>
+        <w:t>Identificar las necesidades de servicios de impresión y diseño gráfico en la comunidad estudiantil y público en general.</w:t>
+      </w:r>
+    </w:p>
+    <w:p>
+      <w:pPr>
+        <w:pStyle w:val="Prrafodelista"/>
+        <w:numPr>
+          <w:ilvl w:val="0"/>
+          <w:numId w:val="7"/>
+        </w:numPr>
+        <w:spacing w:line="360" w:lineRule="auto"/>
+        <w:jc w:val="both"/>
+        <w:rPr>
+          <w:rFonts w:ascii="Times New Roman" w:hAnsi="Times New Roman" w:cs="Times New Roman"/>
+        </w:rPr>
+      </w:pPr>
+      <w:r>
+        <w:rPr>
+          <w:rFonts w:ascii="Times New Roman" w:hAnsi="Times New Roman" w:cs="Times New Roman"/>
+        </w:rPr>
+        <w:t>Implementar procesos de trabajo eficientes que permitan optimizar los tiempos de entrega y la calidad de los productos impresos.</w:t>
+      </w:r>
+    </w:p>
+    <w:p>
+      <w:pPr>
+        <w:pStyle w:val="Prrafodelista"/>
+        <w:numPr>
+          <w:ilvl w:val="0"/>
+          <w:numId w:val="7"/>
+        </w:numPr>
+        <w:spacing w:line="360" w:lineRule="auto"/>
+        <w:jc w:val="both"/>
+        <w:rPr>
+          <w:rFonts w:ascii="Times New Roman" w:hAnsi="Times New Roman" w:cs="Times New Roman"/>
+        </w:rPr>
+      </w:pPr>
+      <w:r>
+        <w:rPr>
+          <w:rFonts w:ascii="Times New Roman" w:hAnsi="Times New Roman" w:cs="Times New Roman"/>
+        </w:rPr>
+        <w:t xml:space="preserve">Ofrecer servicios de diseño gráfico que mejores la presentación visual de trabajos académicos, proyectos y materiales publicitarios ofreciendo un </w:t>
+      </w:r>
+      <w:r>
+        <w:rPr>
+          <w:rFonts w:ascii="Times New Roman" w:hAnsi="Times New Roman" w:cs="Times New Roman"/>
+          <w:highlight w:val="yellow"/>
+        </w:rPr>
+        <w:t>plus de entrega directamente al estudiante en edificio y salón</w:t>
+      </w:r>
+      <w:r>
+        <w:rPr>
+          <w:rFonts w:ascii="Times New Roman" w:hAnsi="Times New Roman" w:cs="Times New Roman"/>
+        </w:rPr>
+        <w:t>.</w:t>
+      </w:r>
+    </w:p>
+    <w:p>
+      <w:pPr>
+        <w:pStyle w:val="Prrafodelista"/>
+        <w:numPr>
+          <w:ilvl w:val="0"/>
+          <w:numId w:val="7"/>
+        </w:numPr>
+        <w:spacing w:line="360" w:lineRule="auto"/>
+        <w:jc w:val="both"/>
+        <w:rPr>
+          <w:rFonts w:ascii="Times New Roman" w:hAnsi="Times New Roman" w:cs="Times New Roman"/>
+        </w:rPr>
+      </w:pPr>
+      <w:r>
+        <w:rPr>
+          <w:rFonts w:ascii="Times New Roman" w:hAnsi="Times New Roman" w:cs="Times New Roman"/>
+        </w:rPr>
+        <w:t>Garantizar el uso de equipo y tecnología adecuados para cumplir con los estándares de calidad en impresión y diseño.</w:t>
+      </w:r>
+    </w:p>
+    <w:p>
+      <w:pPr>
+        <w:pStyle w:val="Prrafodelista"/>
+        <w:numPr>
+          <w:ilvl w:val="0"/>
+          <w:numId w:val="7"/>
+        </w:numPr>
+        <w:spacing w:line="360" w:lineRule="auto"/>
+        <w:jc w:val="both"/>
+        <w:rPr>
+          <w:rFonts w:ascii="Times New Roman" w:hAnsi="Times New Roman" w:cs="Times New Roman"/>
+        </w:rPr>
+      </w:pPr>
+      <w:r>
+        <w:rPr>
+          <w:rFonts w:ascii="Times New Roman" w:hAnsi="Times New Roman" w:cs="Times New Roman"/>
+        </w:rPr>
+        <w:t>Establecer un modelo de servicio accesible en términos de costos para facilitar su uso por parte de estudiantes.</w:t>
+      </w:r>
+    </w:p>
+    <w:p>
+      <w:pPr>
+        <w:pStyle w:val="Prrafodelista"/>
+        <w:numPr>
+          <w:ilvl w:val="0"/>
+          <w:numId w:val="7"/>
+        </w:numPr>
+        <w:spacing w:line="360" w:lineRule="auto"/>
+        <w:jc w:val="both"/>
+        <w:rPr>
+          <w:rFonts w:ascii="Times New Roman" w:hAnsi="Times New Roman" w:cs="Times New Roman"/>
+        </w:rPr>
+      </w:pPr>
+      <w:r>
+        <w:rPr>
+          <w:rFonts w:ascii="Times New Roman" w:hAnsi="Times New Roman" w:cs="Times New Roman"/>
+        </w:rPr>
+        <w:t>Evaluar la viabilidad del proyecto en función de la demanda, recursos disponibles y beneficios para la comunidad</w:t>
+      </w:r>
     </w:p>
     <w:sectPr>
       <w:pgSz w:w="12240" w:h="15840"/>
@@ -1329,9 +1806,9 @@
   </w:abstractNum>
   <w:abstractNum w:abstractNumId="5" w15:restartNumberingAfterBreak="0">
     <w:nsid w:val="456A4121"/>
-    <w:multiLevelType w:val="hybridMultilevel"/>
-    <w:tmpl w:val="800019AC"/>
-    <w:lvl w:ilvl="0" w:tplc="080A000F">
+    <w:multiLevelType w:val="multilevel"/>
+    <w:tmpl w:val="800497B0"/>
+    <w:lvl w:ilvl="0">
       <w:start w:val="1"/>
       <w:numFmt w:val="decimal"/>
       <w:lvlText w:val="%1."/>
@@ -1343,77 +1820,222 @@
         <w:rFonts w:hint="default"/>
       </w:rPr>
     </w:lvl>
-    <w:lvl w:ilvl="1" w:tplc="080A0019" w:tentative="1">
-      <w:start w:val="1"/>
-      <w:numFmt w:val="lowerLetter"/>
-      <w:lvlText w:val="%2."/>
-      <w:lvlJc w:val="left"/>
-      <w:pPr>
-        <w:ind w:left="1440" w:hanging="360"/>
-      </w:pPr>
-    </w:lvl>
-    <w:lvl w:ilvl="2" w:tplc="080A001B" w:tentative="1">
-      <w:start w:val="1"/>
-      <w:numFmt w:val="lowerRoman"/>
-      <w:lvlText w:val="%3."/>
-      <w:lvlJc w:val="right"/>
-      <w:pPr>
-        <w:ind w:left="2160" w:hanging="180"/>
-      </w:pPr>
-    </w:lvl>
-    <w:lvl w:ilvl="3" w:tplc="080A000F" w:tentative="1">
+    <w:lvl w:ilvl="1">
       <w:start w:val="1"/>
       <w:numFmt w:val="decimal"/>
-      <w:lvlText w:val="%4."/>
-      <w:lvlJc w:val="left"/>
-      <w:pPr>
-        <w:ind w:left="2880" w:hanging="360"/>
-      </w:pPr>
-    </w:lvl>
-    <w:lvl w:ilvl="4" w:tplc="080A0019" w:tentative="1">
-      <w:start w:val="1"/>
-      <w:numFmt w:val="lowerLetter"/>
-      <w:lvlText w:val="%5."/>
-      <w:lvlJc w:val="left"/>
-      <w:pPr>
-        <w:ind w:left="3600" w:hanging="360"/>
-      </w:pPr>
-    </w:lvl>
-    <w:lvl w:ilvl="5" w:tplc="080A001B" w:tentative="1">
-      <w:start w:val="1"/>
-      <w:numFmt w:val="lowerRoman"/>
-      <w:lvlText w:val="%6."/>
-      <w:lvlJc w:val="right"/>
-      <w:pPr>
-        <w:ind w:left="4320" w:hanging="180"/>
-      </w:pPr>
-    </w:lvl>
-    <w:lvl w:ilvl="6" w:tplc="080A000F" w:tentative="1">
+      <w:isLgl/>
+      <w:lvlText w:val="%1.%2."/>
+      <w:lvlJc w:val="left"/>
+      <w:pPr>
+        <w:ind w:left="720" w:hanging="360"/>
+      </w:pPr>
+      <w:rPr>
+        <w:rFonts w:hint="default"/>
+      </w:rPr>
+    </w:lvl>
+    <w:lvl w:ilvl="2">
       <w:start w:val="1"/>
       <w:numFmt w:val="decimal"/>
-      <w:lvlText w:val="%7."/>
-      <w:lvlJc w:val="left"/>
-      <w:pPr>
-        <w:ind w:left="5040" w:hanging="360"/>
-      </w:pPr>
-    </w:lvl>
-    <w:lvl w:ilvl="7" w:tplc="080A0019" w:tentative="1">
-      <w:start w:val="1"/>
-      <w:numFmt w:val="lowerLetter"/>
-      <w:lvlText w:val="%8."/>
-      <w:lvlJc w:val="left"/>
-      <w:pPr>
-        <w:ind w:left="5760" w:hanging="360"/>
-      </w:pPr>
-    </w:lvl>
-    <w:lvl w:ilvl="8" w:tplc="080A001B" w:tentative="1">
-      <w:start w:val="1"/>
-      <w:numFmt w:val="lowerRoman"/>
-      <w:lvlText w:val="%9."/>
-      <w:lvlJc w:val="right"/>
-      <w:pPr>
-        <w:ind w:left="6480" w:hanging="180"/>
-      </w:pPr>
+      <w:isLgl/>
+      <w:lvlText w:val="%1.%2.%3."/>
+      <w:lvlJc w:val="left"/>
+      <w:pPr>
+        <w:ind w:left="1080" w:hanging="720"/>
+      </w:pPr>
+      <w:rPr>
+        <w:rFonts w:hint="default"/>
+      </w:rPr>
+    </w:lvl>
+    <w:lvl w:ilvl="3">
+      <w:start w:val="1"/>
+      <w:numFmt w:val="decimal"/>
+      <w:isLgl/>
+      <w:lvlText w:val="%1.%2.%3.%4."/>
+      <w:lvlJc w:val="left"/>
+      <w:pPr>
+        <w:ind w:left="1080" w:hanging="720"/>
+      </w:pPr>
+      <w:rPr>
+        <w:rFonts w:hint="default"/>
+      </w:rPr>
+    </w:lvl>
+    <w:lvl w:ilvl="4">
+      <w:start w:val="1"/>
+      <w:numFmt w:val="decimal"/>
+      <w:isLgl/>
+      <w:lvlText w:val="%1.%2.%3.%4.%5."/>
+      <w:lvlJc w:val="left"/>
+      <w:pPr>
+        <w:ind w:left="1440" w:hanging="1080"/>
+      </w:pPr>
+      <w:rPr>
+        <w:rFonts w:hint="default"/>
+      </w:rPr>
+    </w:lvl>
+    <w:lvl w:ilvl="5">
+      <w:start w:val="1"/>
+      <w:numFmt w:val="decimal"/>
+      <w:isLgl/>
+      <w:lvlText w:val="%1.%2.%3.%4.%5.%6."/>
+      <w:lvlJc w:val="left"/>
+      <w:pPr>
+        <w:ind w:left="1440" w:hanging="1080"/>
+      </w:pPr>
+      <w:rPr>
+        <w:rFonts w:hint="default"/>
+      </w:rPr>
+    </w:lvl>
+    <w:lvl w:ilvl="6">
+      <w:start w:val="1"/>
+      <w:numFmt w:val="decimal"/>
+      <w:isLgl/>
+      <w:lvlText w:val="%1.%2.%3.%4.%5.%6.%7."/>
+      <w:lvlJc w:val="left"/>
+      <w:pPr>
+        <w:ind w:left="1800" w:hanging="1440"/>
+      </w:pPr>
+      <w:rPr>
+        <w:rFonts w:hint="default"/>
+      </w:rPr>
+    </w:lvl>
+    <w:lvl w:ilvl="7">
+      <w:start w:val="1"/>
+      <w:numFmt w:val="decimal"/>
+      <w:isLgl/>
+      <w:lvlText w:val="%1.%2.%3.%4.%5.%6.%7.%8."/>
+      <w:lvlJc w:val="left"/>
+      <w:pPr>
+        <w:ind w:left="1800" w:hanging="1440"/>
+      </w:pPr>
+      <w:rPr>
+        <w:rFonts w:hint="default"/>
+      </w:rPr>
+    </w:lvl>
+    <w:lvl w:ilvl="8">
+      <w:start w:val="1"/>
+      <w:numFmt w:val="decimal"/>
+      <w:isLgl/>
+      <w:lvlText w:val="%1.%2.%3.%4.%5.%6.%7.%8.%9."/>
+      <w:lvlJc w:val="left"/>
+      <w:pPr>
+        <w:ind w:left="2160" w:hanging="1800"/>
+      </w:pPr>
+      <w:rPr>
+        <w:rFonts w:hint="default"/>
+      </w:rPr>
+    </w:lvl>
+  </w:abstractNum>
+  <w:abstractNum w:abstractNumId="6" w15:restartNumberingAfterBreak="0">
+    <w:nsid w:val="58D1101C"/>
+    <w:multiLevelType w:val="hybridMultilevel"/>
+    <w:tmpl w:val="6438569C"/>
+    <w:lvl w:ilvl="0" w:tplc="080A0001">
+      <w:start w:val="1"/>
+      <w:numFmt w:val="bullet"/>
+      <w:lvlText w:val=""/>
+      <w:lvlJc w:val="left"/>
+      <w:pPr>
+        <w:ind w:left="1080" w:hanging="360"/>
+      </w:pPr>
+      <w:rPr>
+        <w:rFonts w:ascii="Symbol" w:hAnsi="Symbol" w:hint="default"/>
+      </w:rPr>
+    </w:lvl>
+    <w:lvl w:ilvl="1" w:tplc="080A0003" w:tentative="1">
+      <w:start w:val="1"/>
+      <w:numFmt w:val="bullet"/>
+      <w:lvlText w:val="o"/>
+      <w:lvlJc w:val="left"/>
+      <w:pPr>
+        <w:ind w:left="1800" w:hanging="360"/>
+      </w:pPr>
+      <w:rPr>
+        <w:rFonts w:ascii="Courier New" w:hAnsi="Courier New" w:cs="Courier New" w:hint="default"/>
+      </w:rPr>
+    </w:lvl>
+    <w:lvl w:ilvl="2" w:tplc="080A0005" w:tentative="1">
+      <w:start w:val="1"/>
+      <w:numFmt w:val="bullet"/>
+      <w:lvlText w:val=""/>
+      <w:lvlJc w:val="left"/>
+      <w:pPr>
+        <w:ind w:left="2520" w:hanging="360"/>
+      </w:pPr>
+      <w:rPr>
+        <w:rFonts w:ascii="Wingdings" w:hAnsi="Wingdings" w:hint="default"/>
+      </w:rPr>
+    </w:lvl>
+    <w:lvl w:ilvl="3" w:tplc="080A0001" w:tentative="1">
+      <w:start w:val="1"/>
+      <w:numFmt w:val="bullet"/>
+      <w:lvlText w:val=""/>
+      <w:lvlJc w:val="left"/>
+      <w:pPr>
+        <w:ind w:left="3240" w:hanging="360"/>
+      </w:pPr>
+      <w:rPr>
+        <w:rFonts w:ascii="Symbol" w:hAnsi="Symbol" w:hint="default"/>
+      </w:rPr>
+    </w:lvl>
+    <w:lvl w:ilvl="4" w:tplc="080A0003" w:tentative="1">
+      <w:start w:val="1"/>
+      <w:numFmt w:val="bullet"/>
+      <w:lvlText w:val="o"/>
+      <w:lvlJc w:val="left"/>
+      <w:pPr>
+        <w:ind w:left="3960" w:hanging="360"/>
+      </w:pPr>
+      <w:rPr>
+        <w:rFonts w:ascii="Courier New" w:hAnsi="Courier New" w:cs="Courier New" w:hint="default"/>
+      </w:rPr>
+    </w:lvl>
+    <w:lvl w:ilvl="5" w:tplc="080A0005" w:tentative="1">
+      <w:start w:val="1"/>
+      <w:numFmt w:val="bullet"/>
+      <w:lvlText w:val=""/>
+      <w:lvlJc w:val="left"/>
+      <w:pPr>
+        <w:ind w:left="4680" w:hanging="360"/>
+      </w:pPr>
+      <w:rPr>
+        <w:rFonts w:ascii="Wingdings" w:hAnsi="Wingdings" w:hint="default"/>
+      </w:rPr>
+    </w:lvl>
+    <w:lvl w:ilvl="6" w:tplc="080A0001" w:tentative="1">
+      <w:start w:val="1"/>
+      <w:numFmt w:val="bullet"/>
+      <w:lvlText w:val=""/>
+      <w:lvlJc w:val="left"/>
+      <w:pPr>
+        <w:ind w:left="5400" w:hanging="360"/>
+      </w:pPr>
+      <w:rPr>
+        <w:rFonts w:ascii="Symbol" w:hAnsi="Symbol" w:hint="default"/>
+      </w:rPr>
+    </w:lvl>
+    <w:lvl w:ilvl="7" w:tplc="080A0003" w:tentative="1">
+      <w:start w:val="1"/>
+      <w:numFmt w:val="bullet"/>
+      <w:lvlText w:val="o"/>
+      <w:lvlJc w:val="left"/>
+      <w:pPr>
+        <w:ind w:left="6120" w:hanging="360"/>
+      </w:pPr>
+      <w:rPr>
+        <w:rFonts w:ascii="Courier New" w:hAnsi="Courier New" w:cs="Courier New" w:hint="default"/>
+      </w:rPr>
+    </w:lvl>
+    <w:lvl w:ilvl="8" w:tplc="080A0005" w:tentative="1">
+      <w:start w:val="1"/>
+      <w:numFmt w:val="bullet"/>
+      <w:lvlText w:val=""/>
+      <w:lvlJc w:val="left"/>
+      <w:pPr>
+        <w:ind w:left="6840" w:hanging="360"/>
+      </w:pPr>
+      <w:rPr>
+        <w:rFonts w:ascii="Wingdings" w:hAnsi="Wingdings" w:hint="default"/>
+      </w:rPr>
     </w:lvl>
   </w:abstractNum>
   <w:num w:numId="1" w16cid:durableId="776602524">
@@ -1433,6 +2055,9 @@
   </w:num>
   <w:num w:numId="6" w16cid:durableId="440302596">
     <w:abstractNumId w:val="0"/>
+  </w:num>
+  <w:num w:numId="7" w16cid:durableId="2134787632">
+    <w:abstractNumId w:val="6"/>
   </w:num>
 </w:numbering>
 </file>

</xml_diff>

<commit_message>
Avance de Estudio Técnico 23-03-2026
</commit_message>
<xml_diff>
--- a/Estudio_Tecnico.docx
+++ b/Estudio_Tecnico.docx
@@ -1898,6 +1898,1466 @@
           <w:rFonts w:ascii="Times New Roman" w:hAnsi="Times New Roman" w:cs="Times New Roman"/>
         </w:rPr>
       </w:pPr>
+      <w:r>
+        <w:rPr>
+          <w:rFonts w:ascii="Times New Roman" w:hAnsi="Times New Roman" w:cs="Times New Roman"/>
+        </w:rPr>
+        <w:t xml:space="preserve">La empresa “Digital </w:t>
+      </w:r>
+      <w:proofErr w:type="spellStart"/>
+      <w:r>
+        <w:rPr>
+          <w:rFonts w:ascii="Times New Roman" w:hAnsi="Times New Roman" w:cs="Times New Roman"/>
+        </w:rPr>
+        <w:t>Vision</w:t>
+      </w:r>
+      <w:proofErr w:type="spellEnd"/>
+      <w:r>
+        <w:rPr>
+          <w:rFonts w:ascii="Times New Roman" w:hAnsi="Times New Roman" w:cs="Times New Roman"/>
+        </w:rPr>
+        <w:t>” ofrecerá una gama integral de servicios orientados a satisfacer las necesidades de impresión y diseño gráfico, tanto para clientes individuales como para el sector académico y empresarial. Estos servicios se clasifican en dos grandes áreas: Servicios de impresión y Servicios de diseño gráfico.</w:t>
+      </w:r>
+    </w:p>
+    <w:p>
+      <w:pPr>
+        <w:pStyle w:val="Prrafodelista"/>
+        <w:numPr>
+          <w:ilvl w:val="2"/>
+          <w:numId w:val="3"/>
+        </w:numPr>
+        <w:spacing w:line="360" w:lineRule="auto"/>
+        <w:jc w:val="both"/>
+        <w:rPr>
+          <w:rFonts w:ascii="Times New Roman" w:hAnsi="Times New Roman" w:cs="Times New Roman"/>
+          <w:b/>
+          <w:bCs/>
+        </w:rPr>
+      </w:pPr>
+      <w:r>
+        <w:rPr>
+          <w:rFonts w:ascii="Times New Roman" w:hAnsi="Times New Roman" w:cs="Times New Roman"/>
+          <w:b/>
+          <w:bCs/>
+        </w:rPr>
+        <w:t>Servicios de impresión</w:t>
+      </w:r>
+    </w:p>
+    <w:p>
+      <w:pPr>
+        <w:spacing w:line="360" w:lineRule="auto"/>
+        <w:ind w:left="360"/>
+        <w:jc w:val="both"/>
+        <w:rPr>
+          <w:rFonts w:ascii="Times New Roman" w:hAnsi="Times New Roman" w:cs="Times New Roman"/>
+        </w:rPr>
+      </w:pPr>
+      <w:r>
+        <w:rPr>
+          <w:rFonts w:ascii="Times New Roman" w:hAnsi="Times New Roman" w:cs="Times New Roman"/>
+        </w:rPr>
+        <w:t>Se proporcionarán soluciones de impresión con tecnología digital y especializada garantizando calidad, rapidez y variedad de formatos:</w:t>
+      </w:r>
+    </w:p>
+    <w:p>
+      <w:pPr>
+        <w:pStyle w:val="Prrafodelista"/>
+        <w:numPr>
+          <w:ilvl w:val="0"/>
+          <w:numId w:val="9"/>
+        </w:numPr>
+        <w:spacing w:line="360" w:lineRule="auto"/>
+        <w:jc w:val="both"/>
+        <w:rPr>
+          <w:rFonts w:ascii="Times New Roman" w:hAnsi="Times New Roman" w:cs="Times New Roman"/>
+          <w:b/>
+          <w:bCs/>
+        </w:rPr>
+      </w:pPr>
+      <w:r>
+        <w:rPr>
+          <w:rFonts w:ascii="Times New Roman" w:hAnsi="Times New Roman" w:cs="Times New Roman"/>
+          <w:b/>
+          <w:bCs/>
+        </w:rPr>
+        <w:t xml:space="preserve">Impresión digital y offset: </w:t>
+      </w:r>
+      <w:r>
+        <w:rPr>
+          <w:rFonts w:ascii="Times New Roman" w:hAnsi="Times New Roman" w:cs="Times New Roman"/>
+        </w:rPr>
+        <w:t>elaboración de volantes, trípticos, posters, revistas, catálogos y menús, adecuados para promoción y difusión de información.</w:t>
+      </w:r>
+    </w:p>
+    <w:p>
+      <w:pPr>
+        <w:pStyle w:val="Prrafodelista"/>
+        <w:numPr>
+          <w:ilvl w:val="0"/>
+          <w:numId w:val="9"/>
+        </w:numPr>
+        <w:spacing w:line="360" w:lineRule="auto"/>
+        <w:jc w:val="both"/>
+        <w:rPr>
+          <w:rFonts w:ascii="Times New Roman" w:hAnsi="Times New Roman" w:cs="Times New Roman"/>
+          <w:b/>
+          <w:bCs/>
+        </w:rPr>
+      </w:pPr>
+      <w:r>
+        <w:rPr>
+          <w:rFonts w:ascii="Times New Roman" w:hAnsi="Times New Roman" w:cs="Times New Roman"/>
+          <w:b/>
+          <w:bCs/>
+        </w:rPr>
+        <w:t>Papelería corporativa:</w:t>
+      </w:r>
+      <w:r>
+        <w:rPr>
+          <w:rFonts w:ascii="Times New Roman" w:hAnsi="Times New Roman" w:cs="Times New Roman"/>
+        </w:rPr>
+        <w:t xml:space="preserve"> diseño e impresión de tarjetas de presentación, hojas membretadas, sobres y carpetas institucionales que fortalecen la identidad empresarial.</w:t>
+      </w:r>
+    </w:p>
+    <w:p>
+      <w:pPr>
+        <w:pStyle w:val="Prrafodelista"/>
+        <w:numPr>
+          <w:ilvl w:val="0"/>
+          <w:numId w:val="9"/>
+        </w:numPr>
+        <w:spacing w:line="360" w:lineRule="auto"/>
+        <w:jc w:val="both"/>
+        <w:rPr>
+          <w:rFonts w:ascii="Times New Roman" w:hAnsi="Times New Roman" w:cs="Times New Roman"/>
+          <w:b/>
+          <w:bCs/>
+        </w:rPr>
+      </w:pPr>
+      <w:r>
+        <w:rPr>
+          <w:rFonts w:ascii="Times New Roman" w:hAnsi="Times New Roman" w:cs="Times New Roman"/>
+          <w:b/>
+          <w:bCs/>
+        </w:rPr>
+        <w:lastRenderedPageBreak/>
+        <w:t>Impresión en gran formato:</w:t>
+      </w:r>
+      <w:r>
+        <w:rPr>
+          <w:rFonts w:ascii="Times New Roman" w:hAnsi="Times New Roman" w:cs="Times New Roman"/>
+        </w:rPr>
+        <w:t xml:space="preserve"> producción de lonas, banners, viniles, roll</w:t>
+      </w:r>
+      <w:r>
+        <w:rPr>
+          <w:rFonts w:ascii="Times New Roman" w:hAnsi="Times New Roman" w:cs="Times New Roman"/>
+        </w:rPr>
+        <w:t>-ups y espectaculares, ideales para publicidad de alto impacto visual.</w:t>
+      </w:r>
+    </w:p>
+    <w:p>
+      <w:pPr>
+        <w:pStyle w:val="Prrafodelista"/>
+        <w:numPr>
+          <w:ilvl w:val="0"/>
+          <w:numId w:val="9"/>
+        </w:numPr>
+        <w:spacing w:line="360" w:lineRule="auto"/>
+        <w:jc w:val="both"/>
+        <w:rPr>
+          <w:rFonts w:ascii="Times New Roman" w:hAnsi="Times New Roman" w:cs="Times New Roman"/>
+          <w:b/>
+          <w:bCs/>
+        </w:rPr>
+      </w:pPr>
+      <w:r>
+        <w:rPr>
+          <w:rFonts w:ascii="Times New Roman" w:hAnsi="Times New Roman" w:cs="Times New Roman"/>
+          <w:b/>
+          <w:bCs/>
+        </w:rPr>
+        <w:t>Documentos especializados:</w:t>
+      </w:r>
+      <w:r>
+        <w:rPr>
+          <w:rFonts w:ascii="Times New Roman" w:hAnsi="Times New Roman" w:cs="Times New Roman"/>
+        </w:rPr>
+        <w:t xml:space="preserve"> impresión y encuadernación de tesis, informes, manuales y planos arquitectónicos, cumpliendo con estándares académicos y profesionales.</w:t>
+      </w:r>
+    </w:p>
+    <w:p>
+      <w:pPr>
+        <w:pStyle w:val="Prrafodelista"/>
+        <w:numPr>
+          <w:ilvl w:val="0"/>
+          <w:numId w:val="9"/>
+        </w:numPr>
+        <w:spacing w:line="360" w:lineRule="auto"/>
+        <w:jc w:val="both"/>
+        <w:rPr>
+          <w:rFonts w:ascii="Times New Roman" w:hAnsi="Times New Roman" w:cs="Times New Roman"/>
+          <w:b/>
+          <w:bCs/>
+        </w:rPr>
+      </w:pPr>
+      <w:r>
+        <w:rPr>
+          <w:rFonts w:ascii="Times New Roman" w:hAnsi="Times New Roman" w:cs="Times New Roman"/>
+          <w:b/>
+          <w:bCs/>
+        </w:rPr>
+        <w:t>Material promocional:</w:t>
+      </w:r>
+      <w:r>
+        <w:rPr>
+          <w:rFonts w:ascii="Times New Roman" w:hAnsi="Times New Roman" w:cs="Times New Roman"/>
+        </w:rPr>
+        <w:t xml:space="preserve"> elaboración de calendario, </w:t>
+      </w:r>
+      <w:proofErr w:type="spellStart"/>
+      <w:r>
+        <w:rPr>
+          <w:rFonts w:ascii="Times New Roman" w:hAnsi="Times New Roman" w:cs="Times New Roman"/>
+        </w:rPr>
+        <w:t>stickers</w:t>
+      </w:r>
+      <w:proofErr w:type="spellEnd"/>
+      <w:r>
+        <w:rPr>
+          <w:rFonts w:ascii="Times New Roman" w:hAnsi="Times New Roman" w:cs="Times New Roman"/>
+        </w:rPr>
+        <w:t>, etiquetas, imanes y libretas personalizadas para campañas publicitarias o uso personal.</w:t>
+      </w:r>
+    </w:p>
+    <w:p>
+      <w:pPr>
+        <w:pStyle w:val="Prrafodelista"/>
+        <w:numPr>
+          <w:ilvl w:val="0"/>
+          <w:numId w:val="9"/>
+        </w:numPr>
+        <w:spacing w:line="360" w:lineRule="auto"/>
+        <w:jc w:val="both"/>
+        <w:rPr>
+          <w:rFonts w:ascii="Times New Roman" w:hAnsi="Times New Roman" w:cs="Times New Roman"/>
+          <w:b/>
+          <w:bCs/>
+        </w:rPr>
+      </w:pPr>
+      <w:r>
+        <w:rPr>
+          <w:rFonts w:ascii="Times New Roman" w:hAnsi="Times New Roman" w:cs="Times New Roman"/>
+          <w:b/>
+          <w:bCs/>
+        </w:rPr>
+        <w:t xml:space="preserve">Empaques y </w:t>
+      </w:r>
+      <w:proofErr w:type="spellStart"/>
+      <w:r>
+        <w:rPr>
+          <w:rFonts w:ascii="Times New Roman" w:hAnsi="Times New Roman" w:cs="Times New Roman"/>
+          <w:b/>
+          <w:bCs/>
+        </w:rPr>
+        <w:t>packaging</w:t>
+      </w:r>
+      <w:proofErr w:type="spellEnd"/>
+      <w:r>
+        <w:rPr>
+          <w:rFonts w:ascii="Times New Roman" w:hAnsi="Times New Roman" w:cs="Times New Roman"/>
+          <w:b/>
+          <w:bCs/>
+        </w:rPr>
+        <w:t>:</w:t>
+      </w:r>
+      <w:r>
+        <w:rPr>
+          <w:rFonts w:ascii="Times New Roman" w:hAnsi="Times New Roman" w:cs="Times New Roman"/>
+        </w:rPr>
+        <w:t xml:space="preserve"> diseño e impresión de cajas, bolsas y etiquetas para productos, contribuyendo a la presentación y comercialización de mercancías.</w:t>
+      </w:r>
+    </w:p>
+    <w:p>
+      <w:pPr>
+        <w:pStyle w:val="Prrafodelista"/>
+        <w:numPr>
+          <w:ilvl w:val="0"/>
+          <w:numId w:val="9"/>
+        </w:numPr>
+        <w:spacing w:line="360" w:lineRule="auto"/>
+        <w:jc w:val="both"/>
+        <w:rPr>
+          <w:rFonts w:ascii="Times New Roman" w:hAnsi="Times New Roman" w:cs="Times New Roman"/>
+          <w:b/>
+          <w:bCs/>
+        </w:rPr>
+      </w:pPr>
+      <w:r>
+        <w:rPr>
+          <w:rFonts w:ascii="Times New Roman" w:hAnsi="Times New Roman" w:cs="Times New Roman"/>
+          <w:b/>
+          <w:bCs/>
+        </w:rPr>
+        <w:t>Grabado personalizado:</w:t>
+      </w:r>
+      <w:r>
+        <w:rPr>
+          <w:rFonts w:ascii="Times New Roman" w:hAnsi="Times New Roman" w:cs="Times New Roman"/>
+        </w:rPr>
+        <w:t xml:space="preserve"> personalización de artículos como tazas mediante técnicas especializadas.</w:t>
+      </w:r>
+    </w:p>
+    <w:p>
+      <w:pPr>
+        <w:pStyle w:val="Prrafodelista"/>
+        <w:numPr>
+          <w:ilvl w:val="0"/>
+          <w:numId w:val="9"/>
+        </w:numPr>
+        <w:spacing w:line="360" w:lineRule="auto"/>
+        <w:jc w:val="both"/>
+        <w:rPr>
+          <w:rFonts w:ascii="Times New Roman" w:hAnsi="Times New Roman" w:cs="Times New Roman"/>
+          <w:b/>
+          <w:bCs/>
+        </w:rPr>
+      </w:pPr>
+      <w:r>
+        <w:rPr>
+          <w:rFonts w:ascii="Times New Roman" w:hAnsi="Times New Roman" w:cs="Times New Roman"/>
+          <w:b/>
+          <w:bCs/>
+        </w:rPr>
+        <w:t>Impresión 3D:</w:t>
+      </w:r>
+      <w:r>
+        <w:rPr>
+          <w:rFonts w:ascii="Times New Roman" w:hAnsi="Times New Roman" w:cs="Times New Roman"/>
+        </w:rPr>
+        <w:t xml:space="preserve"> desarrollo de prototipos y piezas tridimensionales para fines académicos, industriales o creativos.</w:t>
+      </w:r>
+    </w:p>
+    <w:p>
+      <w:pPr>
+        <w:spacing w:line="360" w:lineRule="auto"/>
+        <w:jc w:val="both"/>
+        <w:rPr>
+          <w:rFonts w:ascii="Times New Roman" w:hAnsi="Times New Roman" w:cs="Times New Roman"/>
+        </w:rPr>
+      </w:pPr>
+    </w:p>
+    <w:p>
+      <w:pPr>
+        <w:pStyle w:val="Prrafodelista"/>
+        <w:numPr>
+          <w:ilvl w:val="2"/>
+          <w:numId w:val="3"/>
+        </w:numPr>
+        <w:spacing w:line="360" w:lineRule="auto"/>
+        <w:jc w:val="both"/>
+        <w:rPr>
+          <w:rFonts w:ascii="Times New Roman" w:hAnsi="Times New Roman" w:cs="Times New Roman"/>
+          <w:b/>
+          <w:bCs/>
+        </w:rPr>
+      </w:pPr>
+      <w:r>
+        <w:rPr>
+          <w:rFonts w:ascii="Times New Roman" w:hAnsi="Times New Roman" w:cs="Times New Roman"/>
+          <w:b/>
+          <w:bCs/>
+        </w:rPr>
+        <w:t>Servicios de diseño gráfico</w:t>
+      </w:r>
+    </w:p>
+    <w:p>
+      <w:pPr>
+        <w:spacing w:line="360" w:lineRule="auto"/>
+        <w:ind w:left="360"/>
+        <w:jc w:val="both"/>
+        <w:rPr>
+          <w:rFonts w:ascii="Times New Roman" w:hAnsi="Times New Roman" w:cs="Times New Roman"/>
+        </w:rPr>
+      </w:pPr>
+      <w:r>
+        <w:rPr>
+          <w:rFonts w:ascii="Times New Roman" w:hAnsi="Times New Roman" w:cs="Times New Roman"/>
+        </w:rPr>
+        <w:t>Se ofrecerán servicios creativos enfocados en la comunicación visual efectiva y el fortalecimiento de la identidad de marca:</w:t>
+      </w:r>
+    </w:p>
+    <w:p>
+      <w:pPr>
+        <w:pStyle w:val="Prrafodelista"/>
+        <w:numPr>
+          <w:ilvl w:val="0"/>
+          <w:numId w:val="10"/>
+        </w:numPr>
+        <w:spacing w:line="360" w:lineRule="auto"/>
+        <w:jc w:val="both"/>
+        <w:rPr>
+          <w:rFonts w:ascii="Times New Roman" w:hAnsi="Times New Roman" w:cs="Times New Roman"/>
+        </w:rPr>
+      </w:pPr>
+      <w:r>
+        <w:rPr>
+          <w:rFonts w:ascii="Times New Roman" w:hAnsi="Times New Roman" w:cs="Times New Roman"/>
+          <w:b/>
+          <w:bCs/>
+        </w:rPr>
+        <w:t xml:space="preserve">Branding: </w:t>
+      </w:r>
+      <w:r>
+        <w:rPr>
+          <w:rFonts w:ascii="Times New Roman" w:hAnsi="Times New Roman" w:cs="Times New Roman"/>
+        </w:rPr>
+        <w:t>creación de logotipos, manuales de identidad visual y selección de paletas de colores que definan la imagen corporativa.</w:t>
+      </w:r>
+    </w:p>
+    <w:p>
+      <w:pPr>
+        <w:pStyle w:val="Prrafodelista"/>
+        <w:numPr>
+          <w:ilvl w:val="0"/>
+          <w:numId w:val="10"/>
+        </w:numPr>
+        <w:spacing w:line="360" w:lineRule="auto"/>
+        <w:jc w:val="both"/>
+        <w:rPr>
+          <w:rFonts w:ascii="Times New Roman" w:hAnsi="Times New Roman" w:cs="Times New Roman"/>
+        </w:rPr>
+      </w:pPr>
+      <w:r>
+        <w:rPr>
+          <w:rFonts w:ascii="Times New Roman" w:hAnsi="Times New Roman" w:cs="Times New Roman"/>
+          <w:b/>
+          <w:bCs/>
+        </w:rPr>
+        <w:t>Diseño publicitario:</w:t>
+      </w:r>
+      <w:r>
+        <w:rPr>
+          <w:rFonts w:ascii="Times New Roman" w:hAnsi="Times New Roman" w:cs="Times New Roman"/>
+        </w:rPr>
+        <w:t xml:space="preserve"> desarrollo de </w:t>
+      </w:r>
+      <w:proofErr w:type="spellStart"/>
+      <w:r>
+        <w:rPr>
+          <w:rFonts w:ascii="Times New Roman" w:hAnsi="Times New Roman" w:cs="Times New Roman"/>
+        </w:rPr>
+        <w:t>flyers</w:t>
+      </w:r>
+      <w:proofErr w:type="spellEnd"/>
+      <w:r>
+        <w:rPr>
+          <w:rFonts w:ascii="Times New Roman" w:hAnsi="Times New Roman" w:cs="Times New Roman"/>
+        </w:rPr>
+        <w:t>, carteles, anuncios para redes sociales y material promocional enfocado en la atracción de clientes.</w:t>
+      </w:r>
+    </w:p>
+    <w:p>
+      <w:pPr>
+        <w:pStyle w:val="Prrafodelista"/>
+        <w:numPr>
+          <w:ilvl w:val="0"/>
+          <w:numId w:val="10"/>
+        </w:numPr>
+        <w:spacing w:line="360" w:lineRule="auto"/>
+        <w:jc w:val="both"/>
+        <w:rPr>
+          <w:rFonts w:ascii="Times New Roman" w:hAnsi="Times New Roman" w:cs="Times New Roman"/>
+        </w:rPr>
+      </w:pPr>
+      <w:r>
+        <w:rPr>
+          <w:rFonts w:ascii="Times New Roman" w:hAnsi="Times New Roman" w:cs="Times New Roman"/>
+          <w:b/>
+          <w:bCs/>
+        </w:rPr>
+        <w:t>Diseño editorial:</w:t>
+      </w:r>
+      <w:r>
+        <w:rPr>
+          <w:rFonts w:ascii="Times New Roman" w:hAnsi="Times New Roman" w:cs="Times New Roman"/>
+        </w:rPr>
+        <w:t xml:space="preserve"> maquetación y diseño de revistas, libros y catálogos con una estructura visual profesional.</w:t>
+      </w:r>
+    </w:p>
+    <w:p>
+      <w:pPr>
+        <w:pStyle w:val="Prrafodelista"/>
+        <w:numPr>
+          <w:ilvl w:val="0"/>
+          <w:numId w:val="10"/>
+        </w:numPr>
+        <w:spacing w:line="360" w:lineRule="auto"/>
+        <w:jc w:val="both"/>
+        <w:rPr>
+          <w:rFonts w:ascii="Times New Roman" w:hAnsi="Times New Roman" w:cs="Times New Roman"/>
+        </w:rPr>
+      </w:pPr>
+      <w:r>
+        <w:rPr>
+          <w:rFonts w:ascii="Times New Roman" w:hAnsi="Times New Roman" w:cs="Times New Roman"/>
+          <w:b/>
+          <w:bCs/>
+        </w:rPr>
+        <w:t>Marketing digital:</w:t>
+      </w:r>
+      <w:r>
+        <w:rPr>
+          <w:rFonts w:ascii="Times New Roman" w:hAnsi="Times New Roman" w:cs="Times New Roman"/>
+        </w:rPr>
+        <w:t xml:space="preserve"> creación de banners web, plantillas par</w:t>
+      </w:r>
+      <w:r>
+        <w:rPr>
+          <w:rFonts w:ascii="Times New Roman" w:hAnsi="Times New Roman" w:cs="Times New Roman"/>
+        </w:rPr>
+        <w:t>a redes sociales y contenido visual adaptado a plataformas</w:t>
+      </w:r>
+      <w:r>
+        <w:rPr>
+          <w:rFonts w:ascii="Times New Roman" w:hAnsi="Times New Roman" w:cs="Times New Roman"/>
+        </w:rPr>
+        <w:t xml:space="preserve"> digitales.</w:t>
+      </w:r>
+    </w:p>
+    <w:p>
+      <w:pPr>
+        <w:pStyle w:val="Prrafodelista"/>
+        <w:numPr>
+          <w:ilvl w:val="0"/>
+          <w:numId w:val="10"/>
+        </w:numPr>
+        <w:spacing w:line="360" w:lineRule="auto"/>
+        <w:jc w:val="both"/>
+        <w:rPr>
+          <w:rFonts w:ascii="Times New Roman" w:hAnsi="Times New Roman" w:cs="Times New Roman"/>
+        </w:rPr>
+      </w:pPr>
+      <w:r>
+        <w:rPr>
+          <w:rFonts w:ascii="Times New Roman" w:hAnsi="Times New Roman" w:cs="Times New Roman"/>
+          <w:b/>
+          <w:bCs/>
+        </w:rPr>
+        <w:t>Diseño 3D y multimedia:</w:t>
+      </w:r>
+      <w:r>
+        <w:rPr>
+          <w:rFonts w:ascii="Times New Roman" w:hAnsi="Times New Roman" w:cs="Times New Roman"/>
+        </w:rPr>
+        <w:t xml:space="preserve"> elaboración de renders de productos y contenido visual para pantallas LED o presentaciones digitales.</w:t>
+      </w:r>
+    </w:p>
+    <w:p>
+      <w:pPr>
+        <w:pStyle w:val="Prrafodelista"/>
+        <w:numPr>
+          <w:ilvl w:val="0"/>
+          <w:numId w:val="10"/>
+        </w:numPr>
+        <w:spacing w:line="360" w:lineRule="auto"/>
+        <w:jc w:val="both"/>
+        <w:rPr>
+          <w:rFonts w:ascii="Times New Roman" w:hAnsi="Times New Roman" w:cs="Times New Roman"/>
+        </w:rPr>
+      </w:pPr>
+      <w:r>
+        <w:rPr>
+          <w:rFonts w:ascii="Times New Roman" w:hAnsi="Times New Roman" w:cs="Times New Roman"/>
+          <w:b/>
+          <w:bCs/>
+        </w:rPr>
+        <w:t>Consultoría creativa:</w:t>
+      </w:r>
+      <w:r>
+        <w:rPr>
+          <w:rFonts w:ascii="Times New Roman" w:hAnsi="Times New Roman" w:cs="Times New Roman"/>
+        </w:rPr>
+        <w:t xml:space="preserve"> asesoría en estrategias visuales, campañas publicitarias y comunicación gráfica para optimizar la presencia de marca.</w:t>
+      </w:r>
+    </w:p>
+    <w:p>
+      <w:pPr>
+        <w:spacing w:line="360" w:lineRule="auto"/>
+        <w:jc w:val="both"/>
+        <w:rPr>
+          <w:rFonts w:ascii="Times New Roman" w:hAnsi="Times New Roman" w:cs="Times New Roman"/>
+        </w:rPr>
+      </w:pPr>
+    </w:p>
+    <w:p>
+      <w:pPr>
+        <w:spacing w:line="360" w:lineRule="auto"/>
+        <w:ind w:left="360"/>
+        <w:jc w:val="both"/>
+        <w:rPr>
+          <w:rFonts w:ascii="Times New Roman" w:hAnsi="Times New Roman" w:cs="Times New Roman"/>
+        </w:rPr>
+      </w:pPr>
+      <w:r>
+        <w:rPr>
+          <w:rFonts w:ascii="Times New Roman" w:hAnsi="Times New Roman" w:cs="Times New Roman"/>
+        </w:rPr>
+        <w:lastRenderedPageBreak/>
+        <w:t>Estos servicios permitirán a la empresa posicionarse como una solución integral, al ofrecer</w:t>
+      </w:r>
+      <w:r>
+        <w:rPr>
+          <w:rFonts w:ascii="Times New Roman" w:hAnsi="Times New Roman" w:cs="Times New Roman"/>
+        </w:rPr>
+        <w:t xml:space="preserve"> </w:t>
+      </w:r>
+      <w:r>
+        <w:rPr>
+          <w:rFonts w:ascii="Times New Roman" w:hAnsi="Times New Roman" w:cs="Times New Roman"/>
+        </w:rPr>
+        <w:t>tanto la producción física de materiales como el desarrollo creativo, facilitando al cliente la obtención de productos finales sin necesidad de recurrir a múltiples proveedores.</w:t>
+      </w:r>
+    </w:p>
+    <w:p>
+      <w:pPr>
+        <w:spacing w:line="360" w:lineRule="auto"/>
+        <w:ind w:left="360"/>
+        <w:jc w:val="both"/>
+        <w:rPr>
+          <w:rFonts w:ascii="Times New Roman" w:hAnsi="Times New Roman" w:cs="Times New Roman"/>
+        </w:rPr>
+      </w:pPr>
+    </w:p>
+    <w:p>
+      <w:pPr>
+        <w:pStyle w:val="Prrafodelista"/>
+        <w:numPr>
+          <w:ilvl w:val="1"/>
+          <w:numId w:val="3"/>
+        </w:numPr>
+        <w:spacing w:line="360" w:lineRule="auto"/>
+        <w:jc w:val="both"/>
+        <w:rPr>
+          <w:rFonts w:ascii="Times New Roman" w:hAnsi="Times New Roman" w:cs="Times New Roman"/>
+          <w:b/>
+          <w:bCs/>
+        </w:rPr>
+      </w:pPr>
+      <w:r>
+        <w:rPr>
+          <w:rFonts w:ascii="Times New Roman" w:hAnsi="Times New Roman" w:cs="Times New Roman"/>
+          <w:b/>
+          <w:bCs/>
+        </w:rPr>
+        <w:t xml:space="preserve"> Macrolocalización</w:t>
+      </w:r>
+    </w:p>
+    <w:p>
+      <w:pPr>
+        <w:spacing w:line="360" w:lineRule="auto"/>
+        <w:ind w:left="360"/>
+        <w:jc w:val="both"/>
+        <w:rPr>
+          <w:rFonts w:ascii="Times New Roman" w:hAnsi="Times New Roman" w:cs="Times New Roman"/>
+        </w:rPr>
+      </w:pPr>
+      <w:r>
+        <w:rPr>
+          <w:rFonts w:ascii="Times New Roman" w:hAnsi="Times New Roman" w:cs="Times New Roman"/>
+        </w:rPr>
+        <w:t xml:space="preserve">La macrolocalización del proyecto “Digital </w:t>
+      </w:r>
+      <w:proofErr w:type="spellStart"/>
+      <w:r>
+        <w:rPr>
+          <w:rFonts w:ascii="Times New Roman" w:hAnsi="Times New Roman" w:cs="Times New Roman"/>
+        </w:rPr>
+        <w:t>Vision</w:t>
+      </w:r>
+      <w:proofErr w:type="spellEnd"/>
+      <w:r>
+        <w:rPr>
+          <w:rFonts w:ascii="Times New Roman" w:hAnsi="Times New Roman" w:cs="Times New Roman"/>
+        </w:rPr>
+        <w:t>” considera diversos factores que influyen en la viabilidad y operación de la empresa a nivel regional:</w:t>
+      </w:r>
+    </w:p>
+    <w:p>
+      <w:pPr>
+        <w:pStyle w:val="Prrafodelista"/>
+        <w:numPr>
+          <w:ilvl w:val="0"/>
+          <w:numId w:val="11"/>
+        </w:numPr>
+        <w:spacing w:line="360" w:lineRule="auto"/>
+        <w:jc w:val="both"/>
+        <w:rPr>
+          <w:rFonts w:ascii="Times New Roman" w:hAnsi="Times New Roman" w:cs="Times New Roman"/>
+          <w:b/>
+          <w:bCs/>
+        </w:rPr>
+      </w:pPr>
+      <w:r>
+        <w:rPr>
+          <w:rFonts w:ascii="Times New Roman" w:hAnsi="Times New Roman" w:cs="Times New Roman"/>
+          <w:b/>
+          <w:bCs/>
+        </w:rPr>
+        <w:t>Distancia con los proveedores de insumos</w:t>
+      </w:r>
+    </w:p>
+    <w:p>
+      <w:pPr>
+        <w:spacing w:line="360" w:lineRule="auto"/>
+        <w:ind w:left="360"/>
+        <w:jc w:val="both"/>
+        <w:rPr>
+          <w:rFonts w:ascii="Times New Roman" w:hAnsi="Times New Roman" w:cs="Times New Roman"/>
+        </w:rPr>
+      </w:pPr>
+      <w:r>
+        <w:rPr>
+          <w:rFonts w:ascii="Times New Roman" w:hAnsi="Times New Roman" w:cs="Times New Roman"/>
+        </w:rPr>
+        <w:t>Se cuenta con la ventaja de la disponibilidad de proveedores tanto a nivel nacional como internacional, lo que facilita la adquisición de insumos como papel, tintas, viniles y materiales especializados. Asimismo, existen proveedores locales en la ciudad de Zacatecas, lo que reduce tiempos de entrega y costos de transporte.</w:t>
+      </w:r>
+    </w:p>
+    <w:p>
+      <w:pPr>
+        <w:pStyle w:val="Prrafodelista"/>
+        <w:numPr>
+          <w:ilvl w:val="0"/>
+          <w:numId w:val="11"/>
+        </w:numPr>
+        <w:spacing w:line="360" w:lineRule="auto"/>
+        <w:jc w:val="both"/>
+        <w:rPr>
+          <w:rFonts w:ascii="Times New Roman" w:hAnsi="Times New Roman" w:cs="Times New Roman"/>
+          <w:b/>
+          <w:bCs/>
+        </w:rPr>
+      </w:pPr>
+      <w:r>
+        <w:rPr>
+          <w:rFonts w:ascii="Times New Roman" w:hAnsi="Times New Roman" w:cs="Times New Roman"/>
+          <w:b/>
+          <w:bCs/>
+        </w:rPr>
+        <w:t>Distancia con los clientes</w:t>
+      </w:r>
+    </w:p>
+    <w:p>
+      <w:pPr>
+        <w:spacing w:line="360" w:lineRule="auto"/>
+        <w:ind w:left="360"/>
+        <w:jc w:val="both"/>
+        <w:rPr>
+          <w:rFonts w:ascii="Times New Roman" w:hAnsi="Times New Roman" w:cs="Times New Roman"/>
+        </w:rPr>
+      </w:pPr>
+      <w:r>
+        <w:rPr>
+          <w:rFonts w:ascii="Times New Roman" w:hAnsi="Times New Roman" w:cs="Times New Roman"/>
+        </w:rPr>
+        <w:t>El proyecto está orientado principalmente a un mercado estudiantil y a pequeños negocios locales dentro de la ciudad de Zacatecas, lo cual permite una cercanía estratégica con el cliente objetivo, facilitando la distribución y entrega de los productos.</w:t>
+      </w:r>
+    </w:p>
+    <w:p>
+      <w:pPr>
+        <w:pStyle w:val="Prrafodelista"/>
+        <w:numPr>
+          <w:ilvl w:val="0"/>
+          <w:numId w:val="11"/>
+        </w:numPr>
+        <w:spacing w:line="360" w:lineRule="auto"/>
+        <w:jc w:val="both"/>
+        <w:rPr>
+          <w:rFonts w:ascii="Times New Roman" w:hAnsi="Times New Roman" w:cs="Times New Roman"/>
+          <w:b/>
+          <w:bCs/>
+        </w:rPr>
+      </w:pPr>
+      <w:r>
+        <w:rPr>
+          <w:rFonts w:ascii="Times New Roman" w:hAnsi="Times New Roman" w:cs="Times New Roman"/>
+          <w:b/>
+          <w:bCs/>
+        </w:rPr>
+        <w:t>Dis</w:t>
+      </w:r>
+      <w:r>
+        <w:rPr>
+          <w:rFonts w:ascii="Times New Roman" w:hAnsi="Times New Roman" w:cs="Times New Roman"/>
+          <w:b/>
+          <w:bCs/>
+        </w:rPr>
+        <w:t>ponibilidad de mano de obra calificada</w:t>
+      </w:r>
+    </w:p>
+    <w:p>
+      <w:pPr>
+        <w:spacing w:line="360" w:lineRule="auto"/>
+        <w:ind w:left="360"/>
+        <w:jc w:val="both"/>
+        <w:rPr>
+          <w:rFonts w:ascii="Times New Roman" w:hAnsi="Times New Roman" w:cs="Times New Roman"/>
+        </w:rPr>
+      </w:pPr>
+      <w:r>
+        <w:rPr>
+          <w:rFonts w:ascii="Times New Roman" w:hAnsi="Times New Roman" w:cs="Times New Roman"/>
+        </w:rPr>
+        <w:t xml:space="preserve">La ubicación en una zona con presencia de instituciones educativas, como la Universidad Autónoma de Zacatecas, favorece la disponibilidad de personal capacitado en áreas como diseño gráfico, tecnologías de la información y comunicación visual. </w:t>
+      </w:r>
+    </w:p>
+    <w:p>
+      <w:pPr>
+        <w:pStyle w:val="Prrafodelista"/>
+        <w:numPr>
+          <w:ilvl w:val="0"/>
+          <w:numId w:val="11"/>
+        </w:numPr>
+        <w:spacing w:line="360" w:lineRule="auto"/>
+        <w:jc w:val="both"/>
+        <w:rPr>
+          <w:rFonts w:ascii="Times New Roman" w:hAnsi="Times New Roman" w:cs="Times New Roman"/>
+          <w:b/>
+          <w:bCs/>
+        </w:rPr>
+      </w:pPr>
+      <w:r>
+        <w:rPr>
+          <w:rFonts w:ascii="Times New Roman" w:hAnsi="Times New Roman" w:cs="Times New Roman"/>
+          <w:b/>
+          <w:bCs/>
+        </w:rPr>
+        <w:t>Estímulos fiscales</w:t>
+      </w:r>
+    </w:p>
+    <w:p>
+      <w:pPr>
+        <w:spacing w:line="360" w:lineRule="auto"/>
+        <w:ind w:left="360"/>
+        <w:jc w:val="both"/>
+        <w:rPr>
+          <w:rFonts w:ascii="Times New Roman" w:hAnsi="Times New Roman" w:cs="Times New Roman"/>
+        </w:rPr>
+      </w:pPr>
+      <w:r>
+        <w:rPr>
+          <w:rFonts w:ascii="Times New Roman" w:hAnsi="Times New Roman" w:cs="Times New Roman"/>
+        </w:rPr>
+        <w:t>Dependiendo del régimen fiscal y del tipo de empresa (en este caso sociedad cooperativa), pueden existir beneficios fiscales o apoyos gubernamentales dirigidos a emprendedores, lo cual representa una oportunidad para reducir costos operativos en etapas iniciales.</w:t>
+      </w:r>
+    </w:p>
+    <w:p>
+      <w:pPr>
+        <w:pStyle w:val="Prrafodelista"/>
+        <w:numPr>
+          <w:ilvl w:val="0"/>
+          <w:numId w:val="11"/>
+        </w:numPr>
+        <w:spacing w:line="360" w:lineRule="auto"/>
+        <w:jc w:val="both"/>
+        <w:rPr>
+          <w:rFonts w:ascii="Times New Roman" w:hAnsi="Times New Roman" w:cs="Times New Roman"/>
+          <w:b/>
+          <w:bCs/>
+        </w:rPr>
+      </w:pPr>
+      <w:r>
+        <w:rPr>
+          <w:rFonts w:ascii="Times New Roman" w:hAnsi="Times New Roman" w:cs="Times New Roman"/>
+          <w:b/>
+          <w:bCs/>
+        </w:rPr>
+        <w:t>Posibilidad de eliminación de contaminantes</w:t>
+      </w:r>
+    </w:p>
+    <w:p>
+      <w:pPr>
+        <w:spacing w:line="360" w:lineRule="auto"/>
+        <w:ind w:left="360"/>
+        <w:jc w:val="both"/>
+        <w:rPr>
+          <w:rFonts w:ascii="Times New Roman" w:hAnsi="Times New Roman" w:cs="Times New Roman"/>
+        </w:rPr>
+      </w:pPr>
+      <w:r>
+        <w:rPr>
+          <w:rFonts w:ascii="Times New Roman" w:hAnsi="Times New Roman" w:cs="Times New Roman"/>
+        </w:rPr>
+        <w:lastRenderedPageBreak/>
+        <w:t>Se contempla la implementación de prácticas responsables en el manejo de residuos, tales como reciclaje de papel, disposición adecuada de tintas y materiales químicos, contribuyendo a la reducción del impacto ambiental.</w:t>
+      </w:r>
+    </w:p>
+    <w:p>
+      <w:pPr>
+        <w:pStyle w:val="Prrafodelista"/>
+        <w:numPr>
+          <w:ilvl w:val="0"/>
+          <w:numId w:val="11"/>
+        </w:numPr>
+        <w:spacing w:line="360" w:lineRule="auto"/>
+        <w:jc w:val="both"/>
+        <w:rPr>
+          <w:rFonts w:ascii="Times New Roman" w:hAnsi="Times New Roman" w:cs="Times New Roman"/>
+          <w:b/>
+          <w:bCs/>
+        </w:rPr>
+      </w:pPr>
+      <w:r>
+        <w:rPr>
+          <w:rFonts w:ascii="Times New Roman" w:hAnsi="Times New Roman" w:cs="Times New Roman"/>
+          <w:b/>
+          <w:bCs/>
+        </w:rPr>
+        <w:t>Infraestructura</w:t>
+      </w:r>
+    </w:p>
+    <w:p>
+      <w:pPr>
+        <w:spacing w:line="360" w:lineRule="auto"/>
+        <w:ind w:left="360"/>
+        <w:jc w:val="both"/>
+        <w:rPr>
+          <w:rFonts w:ascii="Times New Roman" w:hAnsi="Times New Roman" w:cs="Times New Roman"/>
+        </w:rPr>
+      </w:pPr>
+      <w:r>
+        <w:rPr>
+          <w:rFonts w:ascii="Times New Roman" w:hAnsi="Times New Roman" w:cs="Times New Roman"/>
+        </w:rPr>
+        <w:t>La ciudad de Zacatecas cuenta con infraestructura urbana adecuada, incluyendo servicios básicos, vías de acceso, transporte y conectividad, lo cual facilita la operación de la empresa. Además, la presencia de zonas comerciales y educativas incrementa el flujo de clientes potenciales.</w:t>
+      </w:r>
+    </w:p>
+    <w:p>
+      <w:pPr>
+        <w:pStyle w:val="Prrafodelista"/>
+        <w:numPr>
+          <w:ilvl w:val="0"/>
+          <w:numId w:val="11"/>
+        </w:numPr>
+        <w:spacing w:line="360" w:lineRule="auto"/>
+        <w:jc w:val="both"/>
+        <w:rPr>
+          <w:rFonts w:ascii="Times New Roman" w:hAnsi="Times New Roman" w:cs="Times New Roman"/>
+          <w:b/>
+          <w:bCs/>
+        </w:rPr>
+      </w:pPr>
+      <w:r>
+        <w:rPr>
+          <w:rFonts w:ascii="Times New Roman" w:hAnsi="Times New Roman" w:cs="Times New Roman"/>
+          <w:b/>
+          <w:bCs/>
+        </w:rPr>
+        <w:t>Competencia</w:t>
+      </w:r>
+    </w:p>
+    <w:p>
+      <w:pPr>
+        <w:spacing w:line="360" w:lineRule="auto"/>
+        <w:ind w:left="360"/>
+        <w:jc w:val="both"/>
+        <w:rPr>
+          <w:rFonts w:ascii="Times New Roman" w:hAnsi="Times New Roman" w:cs="Times New Roman"/>
+        </w:rPr>
+      </w:pPr>
+      <w:r>
+        <w:rPr>
+          <w:rFonts w:ascii="Times New Roman" w:hAnsi="Times New Roman" w:cs="Times New Roman"/>
+        </w:rPr>
+        <w:t>El nivel de competencia en el área es moderado, con presencia de papelerías e imprentas locales. Sin embargo, existe una oportunidad de posicionamiento al ofrecer servicios integrales que combinen impresión, diseño gráfico y asesoría profesional, especialmente enfocados en el sector estudiantil.</w:t>
+      </w:r>
+    </w:p>
+    <w:p>
+      <w:pPr>
+        <w:spacing w:line="360" w:lineRule="auto"/>
+        <w:ind w:left="360"/>
+        <w:jc w:val="both"/>
+        <w:rPr>
+          <w:rFonts w:ascii="Times New Roman" w:hAnsi="Times New Roman" w:cs="Times New Roman"/>
+        </w:rPr>
+      </w:pPr>
+    </w:p>
+    <w:p>
+      <w:pPr>
+        <w:pStyle w:val="Prrafodelista"/>
+        <w:numPr>
+          <w:ilvl w:val="1"/>
+          <w:numId w:val="3"/>
+        </w:numPr>
+        <w:spacing w:line="360" w:lineRule="auto"/>
+        <w:jc w:val="both"/>
+        <w:rPr>
+          <w:rFonts w:ascii="Times New Roman" w:hAnsi="Times New Roman" w:cs="Times New Roman"/>
+          <w:b/>
+          <w:bCs/>
+        </w:rPr>
+      </w:pPr>
+      <w:r>
+        <w:rPr>
+          <w:rFonts w:ascii="Times New Roman" w:hAnsi="Times New Roman" w:cs="Times New Roman"/>
+          <w:b/>
+          <w:bCs/>
+        </w:rPr>
+        <w:t xml:space="preserve"> Microlocalización</w:t>
+      </w:r>
+    </w:p>
+    <w:p>
+      <w:pPr>
+        <w:spacing w:line="360" w:lineRule="auto"/>
+        <w:ind w:left="360"/>
+        <w:jc w:val="both"/>
+        <w:rPr>
+          <w:rFonts w:ascii="Times New Roman" w:hAnsi="Times New Roman" w:cs="Times New Roman"/>
+        </w:rPr>
+      </w:pPr>
+      <w:r>
+        <w:rPr>
+          <w:rFonts w:ascii="Times New Roman" w:hAnsi="Times New Roman" w:cs="Times New Roman"/>
+        </w:rPr>
+        <w:t>La microlocalización del proyecto se sitúa dentro de las instalaciones de la Universidad Autónoma de Zacatecas, específicamente en el edificio E-13 de Ingeniería en Software y Computación, en el tercer piso, lo cual permite un acceso directo al mercado objetivo.</w:t>
+      </w:r>
+    </w:p>
+    <w:p>
+      <w:pPr>
+        <w:pStyle w:val="Prrafodelista"/>
+        <w:numPr>
+          <w:ilvl w:val="0"/>
+          <w:numId w:val="12"/>
+        </w:numPr>
+        <w:spacing w:line="360" w:lineRule="auto"/>
+        <w:jc w:val="both"/>
+        <w:rPr>
+          <w:rFonts w:ascii="Times New Roman" w:hAnsi="Times New Roman" w:cs="Times New Roman"/>
+          <w:b/>
+          <w:bCs/>
+        </w:rPr>
+      </w:pPr>
+      <w:r>
+        <w:rPr>
+          <w:rFonts w:ascii="Times New Roman" w:hAnsi="Times New Roman" w:cs="Times New Roman"/>
+          <w:b/>
+          <w:bCs/>
+        </w:rPr>
+        <w:t>Tipo de suelo</w:t>
+      </w:r>
+    </w:p>
+    <w:p>
+      <w:pPr>
+        <w:spacing w:line="360" w:lineRule="auto"/>
+        <w:ind w:left="360"/>
+        <w:jc w:val="both"/>
+        <w:rPr>
+          <w:rFonts w:ascii="Times New Roman" w:hAnsi="Times New Roman" w:cs="Times New Roman"/>
+        </w:rPr>
+      </w:pPr>
+      <w:r>
+        <w:rPr>
+          <w:rFonts w:ascii="Times New Roman" w:hAnsi="Times New Roman" w:cs="Times New Roman"/>
+        </w:rPr>
+        <w:t xml:space="preserve">El </w:t>
+      </w:r>
+      <w:r>
+        <w:rPr>
+          <w:rFonts w:ascii="Times New Roman" w:hAnsi="Times New Roman" w:cs="Times New Roman"/>
+        </w:rPr>
+        <w:t>área se encuentra dentro de una zona urbana destinada a servicios educativos, lo cual es compatible con las actividades del proyecto.</w:t>
+      </w:r>
+    </w:p>
+    <w:p>
+      <w:pPr>
+        <w:pStyle w:val="Prrafodelista"/>
+        <w:numPr>
+          <w:ilvl w:val="0"/>
+          <w:numId w:val="12"/>
+        </w:numPr>
+        <w:spacing w:line="360" w:lineRule="auto"/>
+        <w:jc w:val="both"/>
+        <w:rPr>
+          <w:rFonts w:ascii="Times New Roman" w:hAnsi="Times New Roman" w:cs="Times New Roman"/>
+          <w:b/>
+          <w:bCs/>
+        </w:rPr>
+      </w:pPr>
+      <w:r>
+        <w:rPr>
+          <w:rFonts w:ascii="Times New Roman" w:hAnsi="Times New Roman" w:cs="Times New Roman"/>
+          <w:b/>
+          <w:bCs/>
+        </w:rPr>
+        <w:t>Tipo de construcción</w:t>
+      </w:r>
+    </w:p>
+    <w:p>
+      <w:pPr>
+        <w:spacing w:line="360" w:lineRule="auto"/>
+        <w:ind w:left="360"/>
+        <w:jc w:val="both"/>
+        <w:rPr>
+          <w:rFonts w:ascii="Times New Roman" w:hAnsi="Times New Roman" w:cs="Times New Roman"/>
+        </w:rPr>
+      </w:pPr>
+      <w:r>
+        <w:rPr>
+          <w:rFonts w:ascii="Times New Roman" w:hAnsi="Times New Roman" w:cs="Times New Roman"/>
+        </w:rPr>
+        <w:t>El establecimiento se ubicará dentro de una infraestructura institucional de tipo educativo, con espacios adecuados para la instalación de equipo de cómputo e impresión.</w:t>
+      </w:r>
+    </w:p>
+    <w:p>
+      <w:pPr>
+        <w:spacing w:line="360" w:lineRule="auto"/>
+        <w:ind w:left="360"/>
+        <w:jc w:val="both"/>
+        <w:rPr>
+          <w:rFonts w:ascii="Times New Roman" w:hAnsi="Times New Roman" w:cs="Times New Roman"/>
+        </w:rPr>
+      </w:pPr>
+    </w:p>
+    <w:p>
+      <w:pPr>
+        <w:spacing w:line="360" w:lineRule="auto"/>
+        <w:ind w:left="360"/>
+        <w:jc w:val="both"/>
+        <w:rPr>
+          <w:rFonts w:ascii="Times New Roman" w:hAnsi="Times New Roman" w:cs="Times New Roman"/>
+        </w:rPr>
+      </w:pPr>
+    </w:p>
+    <w:p>
+      <w:pPr>
+        <w:pStyle w:val="Prrafodelista"/>
+        <w:numPr>
+          <w:ilvl w:val="0"/>
+          <w:numId w:val="12"/>
+        </w:numPr>
+        <w:spacing w:line="360" w:lineRule="auto"/>
+        <w:jc w:val="both"/>
+        <w:rPr>
+          <w:rFonts w:ascii="Times New Roman" w:hAnsi="Times New Roman" w:cs="Times New Roman"/>
+          <w:b/>
+          <w:bCs/>
+        </w:rPr>
+      </w:pPr>
+      <w:r>
+        <w:rPr>
+          <w:rFonts w:ascii="Times New Roman" w:hAnsi="Times New Roman" w:cs="Times New Roman"/>
+          <w:b/>
+          <w:bCs/>
+        </w:rPr>
+        <w:lastRenderedPageBreak/>
+        <w:t>Vías de comunicación</w:t>
+      </w:r>
+    </w:p>
+    <w:p>
+      <w:pPr>
+        <w:spacing w:line="360" w:lineRule="auto"/>
+        <w:ind w:left="360"/>
+        <w:jc w:val="both"/>
+        <w:rPr>
+          <w:rFonts w:ascii="Times New Roman" w:hAnsi="Times New Roman" w:cs="Times New Roman"/>
+        </w:rPr>
+      </w:pPr>
+      <w:r>
+        <w:rPr>
+          <w:rFonts w:ascii="Times New Roman" w:hAnsi="Times New Roman" w:cs="Times New Roman"/>
+        </w:rPr>
+        <w:t>La ubicación cuenta con acceso mediante vialidades principales y transporte público, facilitando la llegada de estudiantes y usuarios externos.</w:t>
+      </w:r>
+    </w:p>
+    <w:p>
+      <w:pPr>
+        <w:pStyle w:val="Prrafodelista"/>
+        <w:numPr>
+          <w:ilvl w:val="0"/>
+          <w:numId w:val="12"/>
+        </w:numPr>
+        <w:spacing w:line="360" w:lineRule="auto"/>
+        <w:jc w:val="both"/>
+        <w:rPr>
+          <w:rFonts w:ascii="Times New Roman" w:hAnsi="Times New Roman" w:cs="Times New Roman"/>
+          <w:b/>
+          <w:bCs/>
+        </w:rPr>
+      </w:pPr>
+      <w:r>
+        <w:rPr>
+          <w:rFonts w:ascii="Times New Roman" w:hAnsi="Times New Roman" w:cs="Times New Roman"/>
+          <w:b/>
+          <w:bCs/>
+        </w:rPr>
+        <w:t>Servicios de comunicación</w:t>
+      </w:r>
+    </w:p>
+    <w:p>
+      <w:pPr>
+        <w:spacing w:line="360" w:lineRule="auto"/>
+        <w:ind w:left="360"/>
+        <w:jc w:val="both"/>
+        <w:rPr>
+          <w:rFonts w:ascii="Times New Roman" w:hAnsi="Times New Roman" w:cs="Times New Roman"/>
+        </w:rPr>
+      </w:pPr>
+      <w:r>
+        <w:rPr>
+          <w:rFonts w:ascii="Times New Roman" w:hAnsi="Times New Roman" w:cs="Times New Roman"/>
+        </w:rPr>
+        <w:t>Se dispone de acceso a internet, telefonía y redes internas de la institución, lo cual es fundamental para la operación del servicio, especialmente en diseño digital y atención al cliente.</w:t>
+      </w:r>
+    </w:p>
+    <w:p>
+      <w:pPr>
+        <w:pStyle w:val="Prrafodelista"/>
+        <w:numPr>
+          <w:ilvl w:val="0"/>
+          <w:numId w:val="12"/>
+        </w:numPr>
+        <w:spacing w:line="360" w:lineRule="auto"/>
+        <w:jc w:val="both"/>
+        <w:rPr>
+          <w:rFonts w:ascii="Times New Roman" w:hAnsi="Times New Roman" w:cs="Times New Roman"/>
+          <w:b/>
+          <w:bCs/>
+        </w:rPr>
+      </w:pPr>
+      <w:r>
+        <w:rPr>
+          <w:rFonts w:ascii="Times New Roman" w:hAnsi="Times New Roman" w:cs="Times New Roman"/>
+          <w:b/>
+          <w:bCs/>
+        </w:rPr>
+        <w:t>Servicios básicos</w:t>
+      </w:r>
+    </w:p>
+    <w:p>
+      <w:pPr>
+        <w:spacing w:line="360" w:lineRule="auto"/>
+        <w:ind w:left="360"/>
+        <w:jc w:val="both"/>
+        <w:rPr>
+          <w:rFonts w:ascii="Times New Roman" w:hAnsi="Times New Roman" w:cs="Times New Roman"/>
+        </w:rPr>
+      </w:pPr>
+      <w:r>
+        <w:rPr>
+          <w:rFonts w:ascii="Times New Roman" w:hAnsi="Times New Roman" w:cs="Times New Roman"/>
+        </w:rPr>
+        <w:t>El inmueble cuenta con suministro de energía eléctrica, agua potable y drenaje, necesarios para el funcionamiento de los equipos de impresión y las actividades diarias.</w:t>
+      </w:r>
+    </w:p>
+    <w:p>
+      <w:pPr>
+        <w:pStyle w:val="Prrafodelista"/>
+        <w:numPr>
+          <w:ilvl w:val="0"/>
+          <w:numId w:val="12"/>
+        </w:numPr>
+        <w:spacing w:line="360" w:lineRule="auto"/>
+        <w:jc w:val="both"/>
+        <w:rPr>
+          <w:rFonts w:ascii="Times New Roman" w:hAnsi="Times New Roman" w:cs="Times New Roman"/>
+          <w:b/>
+          <w:bCs/>
+        </w:rPr>
+      </w:pPr>
+      <w:r>
+        <w:rPr>
+          <w:rFonts w:ascii="Times New Roman" w:hAnsi="Times New Roman" w:cs="Times New Roman"/>
+          <w:b/>
+          <w:bCs/>
+        </w:rPr>
+        <w:t>Eliminación de residuos</w:t>
+      </w:r>
+    </w:p>
+    <w:p>
+      <w:pPr>
+        <w:spacing w:line="360" w:lineRule="auto"/>
+        <w:ind w:left="360"/>
+        <w:jc w:val="both"/>
+        <w:rPr>
+          <w:rFonts w:ascii="Times New Roman" w:hAnsi="Times New Roman" w:cs="Times New Roman"/>
+        </w:rPr>
+      </w:pPr>
+      <w:r>
+        <w:rPr>
+          <w:rFonts w:ascii="Times New Roman" w:hAnsi="Times New Roman" w:cs="Times New Roman"/>
+        </w:rPr>
+        <w:t>Se implementarán medidas para la correcta disposición de residuos, incluyendo reciclaje de papel y manejo responsable de consumibles como cartuchos de tinta y materiales plásticos.</w:t>
+      </w:r>
+    </w:p>
+    <w:p>
+      <w:pPr>
+        <w:pStyle w:val="Prrafodelista"/>
+        <w:numPr>
+          <w:ilvl w:val="0"/>
+          <w:numId w:val="12"/>
+        </w:numPr>
+        <w:spacing w:line="360" w:lineRule="auto"/>
+        <w:jc w:val="both"/>
+        <w:rPr>
+          <w:rFonts w:ascii="Times New Roman" w:hAnsi="Times New Roman" w:cs="Times New Roman"/>
+          <w:b/>
+          <w:bCs/>
+        </w:rPr>
+      </w:pPr>
+      <w:r>
+        <w:rPr>
+          <w:rFonts w:ascii="Times New Roman" w:hAnsi="Times New Roman" w:cs="Times New Roman"/>
+          <w:b/>
+          <w:bCs/>
+        </w:rPr>
+        <w:t>Seguridad y accesibilidad</w:t>
+      </w:r>
+    </w:p>
+    <w:p>
+      <w:pPr>
+        <w:spacing w:line="360" w:lineRule="auto"/>
+        <w:ind w:left="360"/>
+        <w:jc w:val="both"/>
+        <w:rPr>
+          <w:rFonts w:ascii="Times New Roman" w:hAnsi="Times New Roman" w:cs="Times New Roman"/>
+        </w:rPr>
+      </w:pPr>
+      <w:r>
+        <w:rPr>
+          <w:rFonts w:ascii="Times New Roman" w:hAnsi="Times New Roman" w:cs="Times New Roman"/>
+        </w:rPr>
+        <w:t>La ubicación dentro de la institución educativa proporciona condiciones de seguridad, control de acceso y un entorno confiable para clientes y trabajadores.</w:t>
+      </w:r>
+    </w:p>
+    <w:p>
+      <w:pPr>
+        <w:spacing w:line="360" w:lineRule="auto"/>
+        <w:ind w:left="360"/>
+        <w:jc w:val="both"/>
+        <w:rPr>
+          <w:rFonts w:ascii="Times New Roman" w:hAnsi="Times New Roman" w:cs="Times New Roman"/>
+        </w:rPr>
+      </w:pPr>
+    </w:p>
+    <w:p>
+      <w:pPr>
+        <w:pStyle w:val="Prrafodelista"/>
+        <w:numPr>
+          <w:ilvl w:val="1"/>
+          <w:numId w:val="3"/>
+        </w:numPr>
+        <w:spacing w:line="360" w:lineRule="auto"/>
+        <w:jc w:val="both"/>
+        <w:rPr>
+          <w:rFonts w:ascii="Times New Roman" w:hAnsi="Times New Roman" w:cs="Times New Roman"/>
+          <w:b/>
+          <w:bCs/>
+        </w:rPr>
+      </w:pPr>
+      <w:r>
+        <w:rPr>
+          <w:rFonts w:ascii="Times New Roman" w:hAnsi="Times New Roman" w:cs="Times New Roman"/>
+          <w:b/>
+          <w:bCs/>
+        </w:rPr>
+        <w:t xml:space="preserve"> Croquis de la planta (planos)</w:t>
+      </w:r>
+    </w:p>
+    <w:p>
+      <w:pPr>
+        <w:spacing w:line="360" w:lineRule="auto"/>
+        <w:ind w:left="360"/>
+        <w:jc w:val="both"/>
+        <w:rPr>
+          <w:rFonts w:ascii="Times New Roman" w:hAnsi="Times New Roman" w:cs="Times New Roman"/>
+          <w:i/>
+          <w:iCs/>
+        </w:rPr>
+      </w:pPr>
+      <w:r>
+        <w:rPr>
+          <w:rFonts w:ascii="Times New Roman" w:hAnsi="Times New Roman" w:cs="Times New Roman"/>
+          <w:i/>
+          <w:iCs/>
+        </w:rPr>
+        <w:t>Imagen</w:t>
+      </w:r>
+    </w:p>
+    <w:p>
+      <w:pPr>
+        <w:spacing w:line="360" w:lineRule="auto"/>
+        <w:ind w:left="360"/>
+        <w:jc w:val="both"/>
+        <w:rPr>
+          <w:rFonts w:ascii="Times New Roman" w:hAnsi="Times New Roman" w:cs="Times New Roman"/>
+        </w:rPr>
+      </w:pPr>
+    </w:p>
+    <w:p>
+      <w:pPr>
+        <w:pStyle w:val="Prrafodelista"/>
+        <w:numPr>
+          <w:ilvl w:val="1"/>
+          <w:numId w:val="3"/>
+        </w:numPr>
+        <w:spacing w:line="360" w:lineRule="auto"/>
+        <w:jc w:val="both"/>
+        <w:rPr>
+          <w:rFonts w:ascii="Times New Roman" w:hAnsi="Times New Roman" w:cs="Times New Roman"/>
+          <w:b/>
+          <w:bCs/>
+        </w:rPr>
+      </w:pPr>
+      <w:r>
+        <w:rPr>
+          <w:rFonts w:ascii="Times New Roman" w:hAnsi="Times New Roman" w:cs="Times New Roman"/>
+          <w:b/>
+          <w:bCs/>
+        </w:rPr>
+        <w:t>Organigrama</w:t>
+      </w:r>
+    </w:p>
+    <w:p>
+      <w:pPr>
+        <w:spacing w:line="360" w:lineRule="auto"/>
+        <w:ind w:left="360"/>
+        <w:jc w:val="both"/>
+        <w:rPr>
+          <w:rFonts w:ascii="Times New Roman" w:hAnsi="Times New Roman" w:cs="Times New Roman"/>
+          <w:i/>
+          <w:iCs/>
+        </w:rPr>
+      </w:pPr>
+      <w:r>
+        <w:rPr>
+          <w:rFonts w:ascii="Times New Roman" w:hAnsi="Times New Roman" w:cs="Times New Roman"/>
+          <w:i/>
+          <w:iCs/>
+        </w:rPr>
+        <w:t>Imagen</w:t>
+      </w:r>
+    </w:p>
+    <w:p>
+      <w:pPr>
+        <w:spacing w:line="360" w:lineRule="auto"/>
+        <w:ind w:left="360"/>
+        <w:jc w:val="both"/>
+        <w:rPr>
+          <w:rFonts w:ascii="Times New Roman" w:hAnsi="Times New Roman" w:cs="Times New Roman"/>
+        </w:rPr>
+      </w:pPr>
+    </w:p>
+    <w:p>
+      <w:pPr>
+        <w:spacing w:line="360" w:lineRule="auto"/>
+        <w:ind w:left="360"/>
+        <w:jc w:val="both"/>
+        <w:rPr>
+          <w:rFonts w:ascii="Times New Roman" w:hAnsi="Times New Roman" w:cs="Times New Roman"/>
+          <w:b/>
+          <w:bCs/>
+        </w:rPr>
+      </w:pPr>
     </w:p>
     <w:sectPr>
       <w:pgSz w:w="12240" w:h="15840"/>
@@ -2025,6 +3485,119 @@
     </w:lvl>
   </w:abstractNum>
   <w:abstractNum w:abstractNumId="1" w15:restartNumberingAfterBreak="0">
+    <w:nsid w:val="0533229D"/>
+    <w:multiLevelType w:val="hybridMultilevel"/>
+    <w:tmpl w:val="3FD2EB2E"/>
+    <w:lvl w:ilvl="0" w:tplc="080A0001">
+      <w:start w:val="1"/>
+      <w:numFmt w:val="bullet"/>
+      <w:lvlText w:val=""/>
+      <w:lvlJc w:val="left"/>
+      <w:pPr>
+        <w:ind w:left="1080" w:hanging="360"/>
+      </w:pPr>
+      <w:rPr>
+        <w:rFonts w:ascii="Symbol" w:hAnsi="Symbol" w:hint="default"/>
+      </w:rPr>
+    </w:lvl>
+    <w:lvl w:ilvl="1" w:tplc="080A0003" w:tentative="1">
+      <w:start w:val="1"/>
+      <w:numFmt w:val="bullet"/>
+      <w:lvlText w:val="o"/>
+      <w:lvlJc w:val="left"/>
+      <w:pPr>
+        <w:ind w:left="1800" w:hanging="360"/>
+      </w:pPr>
+      <w:rPr>
+        <w:rFonts w:ascii="Courier New" w:hAnsi="Courier New" w:cs="Courier New" w:hint="default"/>
+      </w:rPr>
+    </w:lvl>
+    <w:lvl w:ilvl="2" w:tplc="080A0005" w:tentative="1">
+      <w:start w:val="1"/>
+      <w:numFmt w:val="bullet"/>
+      <w:lvlText w:val=""/>
+      <w:lvlJc w:val="left"/>
+      <w:pPr>
+        <w:ind w:left="2520" w:hanging="360"/>
+      </w:pPr>
+      <w:rPr>
+        <w:rFonts w:ascii="Wingdings" w:hAnsi="Wingdings" w:hint="default"/>
+      </w:rPr>
+    </w:lvl>
+    <w:lvl w:ilvl="3" w:tplc="080A0001" w:tentative="1">
+      <w:start w:val="1"/>
+      <w:numFmt w:val="bullet"/>
+      <w:lvlText w:val=""/>
+      <w:lvlJc w:val="left"/>
+      <w:pPr>
+        <w:ind w:left="3240" w:hanging="360"/>
+      </w:pPr>
+      <w:rPr>
+        <w:rFonts w:ascii="Symbol" w:hAnsi="Symbol" w:hint="default"/>
+      </w:rPr>
+    </w:lvl>
+    <w:lvl w:ilvl="4" w:tplc="080A0003" w:tentative="1">
+      <w:start w:val="1"/>
+      <w:numFmt w:val="bullet"/>
+      <w:lvlText w:val="o"/>
+      <w:lvlJc w:val="left"/>
+      <w:pPr>
+        <w:ind w:left="3960" w:hanging="360"/>
+      </w:pPr>
+      <w:rPr>
+        <w:rFonts w:ascii="Courier New" w:hAnsi="Courier New" w:cs="Courier New" w:hint="default"/>
+      </w:rPr>
+    </w:lvl>
+    <w:lvl w:ilvl="5" w:tplc="080A0005" w:tentative="1">
+      <w:start w:val="1"/>
+      <w:numFmt w:val="bullet"/>
+      <w:lvlText w:val=""/>
+      <w:lvlJc w:val="left"/>
+      <w:pPr>
+        <w:ind w:left="4680" w:hanging="360"/>
+      </w:pPr>
+      <w:rPr>
+        <w:rFonts w:ascii="Wingdings" w:hAnsi="Wingdings" w:hint="default"/>
+      </w:rPr>
+    </w:lvl>
+    <w:lvl w:ilvl="6" w:tplc="080A0001" w:tentative="1">
+      <w:start w:val="1"/>
+      <w:numFmt w:val="bullet"/>
+      <w:lvlText w:val=""/>
+      <w:lvlJc w:val="left"/>
+      <w:pPr>
+        <w:ind w:left="5400" w:hanging="360"/>
+      </w:pPr>
+      <w:rPr>
+        <w:rFonts w:ascii="Symbol" w:hAnsi="Symbol" w:hint="default"/>
+      </w:rPr>
+    </w:lvl>
+    <w:lvl w:ilvl="7" w:tplc="080A0003" w:tentative="1">
+      <w:start w:val="1"/>
+      <w:numFmt w:val="bullet"/>
+      <w:lvlText w:val="o"/>
+      <w:lvlJc w:val="left"/>
+      <w:pPr>
+        <w:ind w:left="6120" w:hanging="360"/>
+      </w:pPr>
+      <w:rPr>
+        <w:rFonts w:ascii="Courier New" w:hAnsi="Courier New" w:cs="Courier New" w:hint="default"/>
+      </w:rPr>
+    </w:lvl>
+    <w:lvl w:ilvl="8" w:tplc="080A0005" w:tentative="1">
+      <w:start w:val="1"/>
+      <w:numFmt w:val="bullet"/>
+      <w:lvlText w:val=""/>
+      <w:lvlJc w:val="left"/>
+      <w:pPr>
+        <w:ind w:left="6840" w:hanging="360"/>
+      </w:pPr>
+      <w:rPr>
+        <w:rFonts w:ascii="Wingdings" w:hAnsi="Wingdings" w:hint="default"/>
+      </w:rPr>
+    </w:lvl>
+  </w:abstractNum>
+  <w:abstractNum w:abstractNumId="2" w15:restartNumberingAfterBreak="0">
     <w:nsid w:val="05E96E68"/>
     <w:multiLevelType w:val="hybridMultilevel"/>
     <w:tmpl w:val="61B86A6C"/>
@@ -2137,7 +3710,96 @@
       </w:rPr>
     </w:lvl>
   </w:abstractNum>
-  <w:abstractNum w:abstractNumId="2" w15:restartNumberingAfterBreak="0">
+  <w:abstractNum w:abstractNumId="3" w15:restartNumberingAfterBreak="0">
+    <w:nsid w:val="181522BB"/>
+    <w:multiLevelType w:val="hybridMultilevel"/>
+    <w:tmpl w:val="5CB2B296"/>
+    <w:lvl w:ilvl="0" w:tplc="080A0017">
+      <w:start w:val="1"/>
+      <w:numFmt w:val="lowerLetter"/>
+      <w:lvlText w:val="%1)"/>
+      <w:lvlJc w:val="left"/>
+      <w:pPr>
+        <w:ind w:left="720" w:hanging="360"/>
+      </w:pPr>
+      <w:rPr>
+        <w:rFonts w:hint="default"/>
+      </w:rPr>
+    </w:lvl>
+    <w:lvl w:ilvl="1" w:tplc="080A0019" w:tentative="1">
+      <w:start w:val="1"/>
+      <w:numFmt w:val="lowerLetter"/>
+      <w:lvlText w:val="%2."/>
+      <w:lvlJc w:val="left"/>
+      <w:pPr>
+        <w:ind w:left="1440" w:hanging="360"/>
+      </w:pPr>
+    </w:lvl>
+    <w:lvl w:ilvl="2" w:tplc="080A001B" w:tentative="1">
+      <w:start w:val="1"/>
+      <w:numFmt w:val="lowerRoman"/>
+      <w:lvlText w:val="%3."/>
+      <w:lvlJc w:val="right"/>
+      <w:pPr>
+        <w:ind w:left="2160" w:hanging="180"/>
+      </w:pPr>
+    </w:lvl>
+    <w:lvl w:ilvl="3" w:tplc="080A000F" w:tentative="1">
+      <w:start w:val="1"/>
+      <w:numFmt w:val="decimal"/>
+      <w:lvlText w:val="%4."/>
+      <w:lvlJc w:val="left"/>
+      <w:pPr>
+        <w:ind w:left="2880" w:hanging="360"/>
+      </w:pPr>
+    </w:lvl>
+    <w:lvl w:ilvl="4" w:tplc="080A0019" w:tentative="1">
+      <w:start w:val="1"/>
+      <w:numFmt w:val="lowerLetter"/>
+      <w:lvlText w:val="%5."/>
+      <w:lvlJc w:val="left"/>
+      <w:pPr>
+        <w:ind w:left="3600" w:hanging="360"/>
+      </w:pPr>
+    </w:lvl>
+    <w:lvl w:ilvl="5" w:tplc="080A001B" w:tentative="1">
+      <w:start w:val="1"/>
+      <w:numFmt w:val="lowerRoman"/>
+      <w:lvlText w:val="%6."/>
+      <w:lvlJc w:val="right"/>
+      <w:pPr>
+        <w:ind w:left="4320" w:hanging="180"/>
+      </w:pPr>
+    </w:lvl>
+    <w:lvl w:ilvl="6" w:tplc="080A000F" w:tentative="1">
+      <w:start w:val="1"/>
+      <w:numFmt w:val="decimal"/>
+      <w:lvlText w:val="%7."/>
+      <w:lvlJc w:val="left"/>
+      <w:pPr>
+        <w:ind w:left="5040" w:hanging="360"/>
+      </w:pPr>
+    </w:lvl>
+    <w:lvl w:ilvl="7" w:tplc="080A0019" w:tentative="1">
+      <w:start w:val="1"/>
+      <w:numFmt w:val="lowerLetter"/>
+      <w:lvlText w:val="%8."/>
+      <w:lvlJc w:val="left"/>
+      <w:pPr>
+        <w:ind w:left="5760" w:hanging="360"/>
+      </w:pPr>
+    </w:lvl>
+    <w:lvl w:ilvl="8" w:tplc="080A001B" w:tentative="1">
+      <w:start w:val="1"/>
+      <w:numFmt w:val="lowerRoman"/>
+      <w:lvlText w:val="%9."/>
+      <w:lvlJc w:val="right"/>
+      <w:pPr>
+        <w:ind w:left="6480" w:hanging="180"/>
+      </w:pPr>
+    </w:lvl>
+  </w:abstractNum>
+  <w:abstractNum w:abstractNumId="4" w15:restartNumberingAfterBreak="0">
     <w:nsid w:val="218A65E7"/>
     <w:multiLevelType w:val="hybridMultilevel"/>
     <w:tmpl w:val="1C44A830"/>
@@ -2250,7 +3912,7 @@
       </w:rPr>
     </w:lvl>
   </w:abstractNum>
-  <w:abstractNum w:abstractNumId="3" w15:restartNumberingAfterBreak="0">
+  <w:abstractNum w:abstractNumId="5" w15:restartNumberingAfterBreak="0">
     <w:nsid w:val="22821A80"/>
     <w:multiLevelType w:val="hybridMultilevel"/>
     <w:tmpl w:val="C136CD78"/>
@@ -2363,7 +4025,7 @@
       </w:rPr>
     </w:lvl>
   </w:abstractNum>
-  <w:abstractNum w:abstractNumId="4" w15:restartNumberingAfterBreak="0">
+  <w:abstractNum w:abstractNumId="6" w15:restartNumberingAfterBreak="0">
     <w:nsid w:val="2A7A3BA6"/>
     <w:multiLevelType w:val="hybridMultilevel"/>
     <w:tmpl w:val="4E0EDB20"/>
@@ -2452,7 +4114,120 @@
       </w:pPr>
     </w:lvl>
   </w:abstractNum>
-  <w:abstractNum w:abstractNumId="5" w15:restartNumberingAfterBreak="0">
+  <w:abstractNum w:abstractNumId="7" w15:restartNumberingAfterBreak="0">
+    <w:nsid w:val="37143169"/>
+    <w:multiLevelType w:val="hybridMultilevel"/>
+    <w:tmpl w:val="867A6E3A"/>
+    <w:lvl w:ilvl="0" w:tplc="080A0001">
+      <w:start w:val="1"/>
+      <w:numFmt w:val="bullet"/>
+      <w:lvlText w:val=""/>
+      <w:lvlJc w:val="left"/>
+      <w:pPr>
+        <w:ind w:left="1080" w:hanging="360"/>
+      </w:pPr>
+      <w:rPr>
+        <w:rFonts w:ascii="Symbol" w:hAnsi="Symbol" w:hint="default"/>
+      </w:rPr>
+    </w:lvl>
+    <w:lvl w:ilvl="1" w:tplc="080A0003" w:tentative="1">
+      <w:start w:val="1"/>
+      <w:numFmt w:val="bullet"/>
+      <w:lvlText w:val="o"/>
+      <w:lvlJc w:val="left"/>
+      <w:pPr>
+        <w:ind w:left="1800" w:hanging="360"/>
+      </w:pPr>
+      <w:rPr>
+        <w:rFonts w:ascii="Courier New" w:hAnsi="Courier New" w:cs="Courier New" w:hint="default"/>
+      </w:rPr>
+    </w:lvl>
+    <w:lvl w:ilvl="2" w:tplc="080A0005" w:tentative="1">
+      <w:start w:val="1"/>
+      <w:numFmt w:val="bullet"/>
+      <w:lvlText w:val=""/>
+      <w:lvlJc w:val="left"/>
+      <w:pPr>
+        <w:ind w:left="2520" w:hanging="360"/>
+      </w:pPr>
+      <w:rPr>
+        <w:rFonts w:ascii="Wingdings" w:hAnsi="Wingdings" w:hint="default"/>
+      </w:rPr>
+    </w:lvl>
+    <w:lvl w:ilvl="3" w:tplc="080A0001" w:tentative="1">
+      <w:start w:val="1"/>
+      <w:numFmt w:val="bullet"/>
+      <w:lvlText w:val=""/>
+      <w:lvlJc w:val="left"/>
+      <w:pPr>
+        <w:ind w:left="3240" w:hanging="360"/>
+      </w:pPr>
+      <w:rPr>
+        <w:rFonts w:ascii="Symbol" w:hAnsi="Symbol" w:hint="default"/>
+      </w:rPr>
+    </w:lvl>
+    <w:lvl w:ilvl="4" w:tplc="080A0003" w:tentative="1">
+      <w:start w:val="1"/>
+      <w:numFmt w:val="bullet"/>
+      <w:lvlText w:val="o"/>
+      <w:lvlJc w:val="left"/>
+      <w:pPr>
+        <w:ind w:left="3960" w:hanging="360"/>
+      </w:pPr>
+      <w:rPr>
+        <w:rFonts w:ascii="Courier New" w:hAnsi="Courier New" w:cs="Courier New" w:hint="default"/>
+      </w:rPr>
+    </w:lvl>
+    <w:lvl w:ilvl="5" w:tplc="080A0005" w:tentative="1">
+      <w:start w:val="1"/>
+      <w:numFmt w:val="bullet"/>
+      <w:lvlText w:val=""/>
+      <w:lvlJc w:val="left"/>
+      <w:pPr>
+        <w:ind w:left="4680" w:hanging="360"/>
+      </w:pPr>
+      <w:rPr>
+        <w:rFonts w:ascii="Wingdings" w:hAnsi="Wingdings" w:hint="default"/>
+      </w:rPr>
+    </w:lvl>
+    <w:lvl w:ilvl="6" w:tplc="080A0001" w:tentative="1">
+      <w:start w:val="1"/>
+      <w:numFmt w:val="bullet"/>
+      <w:lvlText w:val=""/>
+      <w:lvlJc w:val="left"/>
+      <w:pPr>
+        <w:ind w:left="5400" w:hanging="360"/>
+      </w:pPr>
+      <w:rPr>
+        <w:rFonts w:ascii="Symbol" w:hAnsi="Symbol" w:hint="default"/>
+      </w:rPr>
+    </w:lvl>
+    <w:lvl w:ilvl="7" w:tplc="080A0003" w:tentative="1">
+      <w:start w:val="1"/>
+      <w:numFmt w:val="bullet"/>
+      <w:lvlText w:val="o"/>
+      <w:lvlJc w:val="left"/>
+      <w:pPr>
+        <w:ind w:left="6120" w:hanging="360"/>
+      </w:pPr>
+      <w:rPr>
+        <w:rFonts w:ascii="Courier New" w:hAnsi="Courier New" w:cs="Courier New" w:hint="default"/>
+      </w:rPr>
+    </w:lvl>
+    <w:lvl w:ilvl="8" w:tplc="080A0005" w:tentative="1">
+      <w:start w:val="1"/>
+      <w:numFmt w:val="bullet"/>
+      <w:lvlText w:val=""/>
+      <w:lvlJc w:val="left"/>
+      <w:pPr>
+        <w:ind w:left="6840" w:hanging="360"/>
+      </w:pPr>
+      <w:rPr>
+        <w:rFonts w:ascii="Wingdings" w:hAnsi="Wingdings" w:hint="default"/>
+      </w:rPr>
+    </w:lvl>
+  </w:abstractNum>
+  <w:abstractNum w:abstractNumId="8" w15:restartNumberingAfterBreak="0">
     <w:nsid w:val="456A4121"/>
     <w:multiLevelType w:val="multilevel"/>
     <w:tmpl w:val="800497B0"/>
@@ -2573,7 +4348,7 @@
       </w:rPr>
     </w:lvl>
   </w:abstractNum>
-  <w:abstractNum w:abstractNumId="6" w15:restartNumberingAfterBreak="0">
+  <w:abstractNum w:abstractNumId="9" w15:restartNumberingAfterBreak="0">
     <w:nsid w:val="58D1101C"/>
     <w:multiLevelType w:val="hybridMultilevel"/>
     <w:tmpl w:val="6438569C"/>
@@ -2686,7 +4461,7 @@
       </w:rPr>
     </w:lvl>
   </w:abstractNum>
-  <w:abstractNum w:abstractNumId="7" w15:restartNumberingAfterBreak="0">
+  <w:abstractNum w:abstractNumId="10" w15:restartNumberingAfterBreak="0">
     <w:nsid w:val="65CC0AA4"/>
     <w:multiLevelType w:val="hybridMultilevel"/>
     <w:tmpl w:val="C18EE5AE"/>
@@ -2799,29 +4574,130 @@
       </w:rPr>
     </w:lvl>
   </w:abstractNum>
+  <w:abstractNum w:abstractNumId="11" w15:restartNumberingAfterBreak="0">
+    <w:nsid w:val="7F1C1E9E"/>
+    <w:multiLevelType w:val="hybridMultilevel"/>
+    <w:tmpl w:val="11EE222A"/>
+    <w:lvl w:ilvl="0" w:tplc="080A0017">
+      <w:start w:val="1"/>
+      <w:numFmt w:val="lowerLetter"/>
+      <w:lvlText w:val="%1)"/>
+      <w:lvlJc w:val="left"/>
+      <w:pPr>
+        <w:ind w:left="720" w:hanging="360"/>
+      </w:pPr>
+      <w:rPr>
+        <w:rFonts w:hint="default"/>
+      </w:rPr>
+    </w:lvl>
+    <w:lvl w:ilvl="1" w:tplc="080A0019" w:tentative="1">
+      <w:start w:val="1"/>
+      <w:numFmt w:val="lowerLetter"/>
+      <w:lvlText w:val="%2."/>
+      <w:lvlJc w:val="left"/>
+      <w:pPr>
+        <w:ind w:left="1440" w:hanging="360"/>
+      </w:pPr>
+    </w:lvl>
+    <w:lvl w:ilvl="2" w:tplc="080A001B" w:tentative="1">
+      <w:start w:val="1"/>
+      <w:numFmt w:val="lowerRoman"/>
+      <w:lvlText w:val="%3."/>
+      <w:lvlJc w:val="right"/>
+      <w:pPr>
+        <w:ind w:left="2160" w:hanging="180"/>
+      </w:pPr>
+    </w:lvl>
+    <w:lvl w:ilvl="3" w:tplc="080A000F" w:tentative="1">
+      <w:start w:val="1"/>
+      <w:numFmt w:val="decimal"/>
+      <w:lvlText w:val="%4."/>
+      <w:lvlJc w:val="left"/>
+      <w:pPr>
+        <w:ind w:left="2880" w:hanging="360"/>
+      </w:pPr>
+    </w:lvl>
+    <w:lvl w:ilvl="4" w:tplc="080A0019" w:tentative="1">
+      <w:start w:val="1"/>
+      <w:numFmt w:val="lowerLetter"/>
+      <w:lvlText w:val="%5."/>
+      <w:lvlJc w:val="left"/>
+      <w:pPr>
+        <w:ind w:left="3600" w:hanging="360"/>
+      </w:pPr>
+    </w:lvl>
+    <w:lvl w:ilvl="5" w:tplc="080A001B" w:tentative="1">
+      <w:start w:val="1"/>
+      <w:numFmt w:val="lowerRoman"/>
+      <w:lvlText w:val="%6."/>
+      <w:lvlJc w:val="right"/>
+      <w:pPr>
+        <w:ind w:left="4320" w:hanging="180"/>
+      </w:pPr>
+    </w:lvl>
+    <w:lvl w:ilvl="6" w:tplc="080A000F" w:tentative="1">
+      <w:start w:val="1"/>
+      <w:numFmt w:val="decimal"/>
+      <w:lvlText w:val="%7."/>
+      <w:lvlJc w:val="left"/>
+      <w:pPr>
+        <w:ind w:left="5040" w:hanging="360"/>
+      </w:pPr>
+    </w:lvl>
+    <w:lvl w:ilvl="7" w:tplc="080A0019" w:tentative="1">
+      <w:start w:val="1"/>
+      <w:numFmt w:val="lowerLetter"/>
+      <w:lvlText w:val="%8."/>
+      <w:lvlJc w:val="left"/>
+      <w:pPr>
+        <w:ind w:left="5760" w:hanging="360"/>
+      </w:pPr>
+    </w:lvl>
+    <w:lvl w:ilvl="8" w:tplc="080A001B" w:tentative="1">
+      <w:start w:val="1"/>
+      <w:numFmt w:val="lowerRoman"/>
+      <w:lvlText w:val="%9."/>
+      <w:lvlJc w:val="right"/>
+      <w:pPr>
+        <w:ind w:left="6480" w:hanging="180"/>
+      </w:pPr>
+    </w:lvl>
+  </w:abstractNum>
   <w:num w:numId="1" w16cid:durableId="776602524">
-    <w:abstractNumId w:val="3"/>
+    <w:abstractNumId w:val="5"/>
   </w:num>
   <w:num w:numId="2" w16cid:durableId="1416853395">
-    <w:abstractNumId w:val="4"/>
+    <w:abstractNumId w:val="6"/>
   </w:num>
   <w:num w:numId="3" w16cid:durableId="345180104">
-    <w:abstractNumId w:val="5"/>
+    <w:abstractNumId w:val="8"/>
   </w:num>
   <w:num w:numId="4" w16cid:durableId="439646508">
-    <w:abstractNumId w:val="1"/>
+    <w:abstractNumId w:val="2"/>
   </w:num>
   <w:num w:numId="5" w16cid:durableId="96878089">
-    <w:abstractNumId w:val="2"/>
+    <w:abstractNumId w:val="4"/>
   </w:num>
   <w:num w:numId="6" w16cid:durableId="440302596">
     <w:abstractNumId w:val="0"/>
   </w:num>
   <w:num w:numId="7" w16cid:durableId="2134787632">
-    <w:abstractNumId w:val="6"/>
+    <w:abstractNumId w:val="9"/>
   </w:num>
   <w:num w:numId="8" w16cid:durableId="689527085">
+    <w:abstractNumId w:val="10"/>
+  </w:num>
+  <w:num w:numId="9" w16cid:durableId="1510176707">
     <w:abstractNumId w:val="7"/>
+  </w:num>
+  <w:num w:numId="10" w16cid:durableId="488636865">
+    <w:abstractNumId w:val="1"/>
+  </w:num>
+  <w:num w:numId="11" w16cid:durableId="115415298">
+    <w:abstractNumId w:val="11"/>
+  </w:num>
+  <w:num w:numId="12" w16cid:durableId="939413747">
+    <w:abstractNumId w:val="3"/>
   </w:num>
 </w:numbering>
 </file>
@@ -3429,6 +5305,7 @@
   <w:style w:type="character" w:default="1" w:styleId="Fuentedeprrafopredeter">
     <w:name w:val="Default Paragraph Font"/>
     <w:uiPriority w:val="1"/>
+    <w:semiHidden/>
     <w:unhideWhenUsed/>
   </w:style>
   <w:style w:type="table" w:default="1" w:styleId="Tablanormal">

</xml_diff>

<commit_message>
Actualizacion FODA en doc
</commit_message>
<xml_diff>
--- a/Estudio_Tecnico.docx
+++ b/Estudio_Tecnico.docx
@@ -3202,6 +3202,7 @@
       <w:r>
         <w:rPr>
           <w:rFonts w:ascii="Times New Roman" w:hAnsi="Times New Roman" w:cs="Times New Roman"/>
+          <w:noProof/>
         </w:rPr>
         <w:drawing>
           <wp:inline distT="0" distB="0" distL="0" distR="0" wp14:anchorId="25797967" wp14:editId="39C35765">
@@ -6717,7 +6718,23 @@
                 <w:szCs w:val="16"/>
               </w:rPr>
               <w:br/>
-              <w:t>-Convertir la atención en ventas efectivas así como ofrecer productos adicionales.</w:t>
+              <w:t xml:space="preserve">-Convertir la atención en ventas </w:t>
+            </w:r>
+            <w:r>
+              <w:rPr>
+                <w:rFonts w:ascii="Century Gothic" w:eastAsia="Century Gothic" w:hAnsi="Century Gothic" w:cs="Century Gothic"/>
+                <w:sz w:val="16"/>
+                <w:szCs w:val="16"/>
+              </w:rPr>
+              <w:t>efectivas,</w:t>
+            </w:r>
+            <w:r>
+              <w:rPr>
+                <w:rFonts w:ascii="Century Gothic" w:eastAsia="Century Gothic" w:hAnsi="Century Gothic" w:cs="Century Gothic"/>
+                <w:sz w:val="16"/>
+                <w:szCs w:val="16"/>
+              </w:rPr>
+              <w:t xml:space="preserve"> así como ofrecer productos adicionales.</w:t>
             </w:r>
           </w:p>
           <w:p>
@@ -12844,6 +12861,695 @@
         <w:t>.</w:t>
       </w:r>
     </w:p>
+    <w:p>
+      <w:pPr>
+        <w:spacing w:line="360" w:lineRule="auto"/>
+        <w:ind w:left="360"/>
+        <w:jc w:val="both"/>
+        <w:rPr>
+          <w:rFonts w:ascii="Times New Roman" w:hAnsi="Times New Roman" w:cs="Times New Roman"/>
+        </w:rPr>
+      </w:pPr>
+    </w:p>
+    <w:p>
+      <w:pPr>
+        <w:pStyle w:val="Prrafodelista"/>
+        <w:numPr>
+          <w:ilvl w:val="1"/>
+          <w:numId w:val="3"/>
+        </w:numPr>
+        <w:spacing w:line="360" w:lineRule="auto"/>
+        <w:jc w:val="both"/>
+        <w:rPr>
+          <w:rFonts w:ascii="Times New Roman" w:hAnsi="Times New Roman" w:cs="Times New Roman"/>
+          <w:b/>
+          <w:bCs/>
+        </w:rPr>
+      </w:pPr>
+      <w:r>
+        <w:rPr>
+          <w:rFonts w:ascii="Times New Roman" w:hAnsi="Times New Roman" w:cs="Times New Roman"/>
+          <w:b/>
+          <w:bCs/>
+        </w:rPr>
+        <w:t>Análisis FODA</w:t>
+      </w:r>
+    </w:p>
+    <w:p>
+      <w:pPr>
+        <w:spacing w:line="360" w:lineRule="auto"/>
+        <w:ind w:left="360"/>
+        <w:jc w:val="both"/>
+        <w:rPr>
+          <w:rFonts w:ascii="Times New Roman" w:hAnsi="Times New Roman" w:cs="Times New Roman"/>
+        </w:rPr>
+      </w:pPr>
+      <w:r>
+        <w:rPr>
+          <w:rFonts w:ascii="Times New Roman" w:hAnsi="Times New Roman" w:cs="Times New Roman"/>
+        </w:rPr>
+        <w:t xml:space="preserve">Con el propósito de identificar los factores internos y externos que pueden influir en el desarrollo y crecimiento de la empresa, se realizó un análisis FODA, el cual permite evaluar las fortalezas, oportunidades, debilidades y amenazas relacionadas con la operación del proyecto. </w:t>
+      </w:r>
+    </w:p>
+    <w:p>
+      <w:pPr>
+        <w:spacing w:line="360" w:lineRule="auto"/>
+        <w:ind w:left="360"/>
+        <w:jc w:val="both"/>
+        <w:rPr>
+          <w:rFonts w:ascii="Times New Roman" w:hAnsi="Times New Roman" w:cs="Times New Roman"/>
+        </w:rPr>
+      </w:pPr>
+      <w:r>
+        <w:rPr>
+          <w:rFonts w:ascii="Times New Roman" w:hAnsi="Times New Roman" w:cs="Times New Roman"/>
+        </w:rPr>
+        <w:lastRenderedPageBreak/>
+        <w:t>Este análisis facilita la identificación de ventajas competitivas, áreas de mejora y posibles riesgos del ent</w:t>
+      </w:r>
+      <w:r>
+        <w:rPr>
+          <w:rFonts w:ascii="Times New Roman" w:hAnsi="Times New Roman" w:cs="Times New Roman"/>
+        </w:rPr>
+        <w:t>or</w:t>
+      </w:r>
+      <w:r>
+        <w:rPr>
+          <w:rFonts w:ascii="Times New Roman" w:hAnsi="Times New Roman" w:cs="Times New Roman"/>
+        </w:rPr>
+        <w:t>no, contribuyendo a la toma de decisiones estratégicas para la empresa.</w:t>
+      </w:r>
+    </w:p>
+    <w:p>
+      <w:pPr>
+        <w:spacing w:line="360" w:lineRule="auto"/>
+        <w:ind w:left="360"/>
+        <w:jc w:val="both"/>
+        <w:rPr>
+          <w:rFonts w:ascii="Times New Roman" w:hAnsi="Times New Roman" w:cs="Times New Roman"/>
+        </w:rPr>
+      </w:pPr>
+    </w:p>
+    <w:p>
+      <w:pPr>
+        <w:pStyle w:val="Prrafodelista"/>
+        <w:numPr>
+          <w:ilvl w:val="2"/>
+          <w:numId w:val="3"/>
+        </w:numPr>
+        <w:spacing w:line="360" w:lineRule="auto"/>
+        <w:jc w:val="both"/>
+        <w:rPr>
+          <w:rFonts w:ascii="Times New Roman" w:hAnsi="Times New Roman" w:cs="Times New Roman"/>
+          <w:b/>
+          <w:bCs/>
+        </w:rPr>
+      </w:pPr>
+      <w:r>
+        <w:rPr>
+          <w:rFonts w:ascii="Times New Roman" w:hAnsi="Times New Roman" w:cs="Times New Roman"/>
+          <w:b/>
+          <w:bCs/>
+        </w:rPr>
+        <w:t>Fortalezas</w:t>
+      </w:r>
+    </w:p>
+    <w:p>
+      <w:pPr>
+        <w:pStyle w:val="Prrafodelista"/>
+        <w:numPr>
+          <w:ilvl w:val="0"/>
+          <w:numId w:val="16"/>
+        </w:numPr>
+        <w:spacing w:line="360" w:lineRule="auto"/>
+        <w:jc w:val="both"/>
+        <w:rPr>
+          <w:rFonts w:ascii="Times New Roman" w:hAnsi="Times New Roman" w:cs="Times New Roman"/>
+        </w:rPr>
+      </w:pPr>
+      <w:r>
+        <w:rPr>
+          <w:rFonts w:ascii="Times New Roman" w:hAnsi="Times New Roman" w:cs="Times New Roman"/>
+        </w:rPr>
+        <w:t>Ubicación estratégica cerca a instituciones educativas y zonas con alta demanda estudiantil.</w:t>
+      </w:r>
+    </w:p>
+    <w:p>
+      <w:pPr>
+        <w:pStyle w:val="Prrafodelista"/>
+        <w:numPr>
+          <w:ilvl w:val="0"/>
+          <w:numId w:val="16"/>
+        </w:numPr>
+        <w:spacing w:line="360" w:lineRule="auto"/>
+        <w:jc w:val="both"/>
+        <w:rPr>
+          <w:rFonts w:ascii="Times New Roman" w:hAnsi="Times New Roman" w:cs="Times New Roman"/>
+        </w:rPr>
+      </w:pPr>
+      <w:r>
+        <w:rPr>
+          <w:rFonts w:ascii="Times New Roman" w:hAnsi="Times New Roman" w:cs="Times New Roman"/>
+        </w:rPr>
+        <w:t>Capacidad para adaptarse tanto a proyectos pequeños como a trabajos de mayor volumen.</w:t>
+      </w:r>
+    </w:p>
+    <w:p>
+      <w:pPr>
+        <w:pStyle w:val="Prrafodelista"/>
+        <w:numPr>
+          <w:ilvl w:val="0"/>
+          <w:numId w:val="16"/>
+        </w:numPr>
+        <w:spacing w:line="360" w:lineRule="auto"/>
+        <w:jc w:val="both"/>
+        <w:rPr>
+          <w:rFonts w:ascii="Times New Roman" w:hAnsi="Times New Roman" w:cs="Times New Roman"/>
+        </w:rPr>
+      </w:pPr>
+      <w:r>
+        <w:rPr>
+          <w:rFonts w:ascii="Times New Roman" w:hAnsi="Times New Roman" w:cs="Times New Roman"/>
+        </w:rPr>
+        <w:t>Atención personalizada y comunicación directa con los clientes.</w:t>
+      </w:r>
+    </w:p>
+    <w:p>
+      <w:pPr>
+        <w:pStyle w:val="Prrafodelista"/>
+        <w:numPr>
+          <w:ilvl w:val="0"/>
+          <w:numId w:val="16"/>
+        </w:numPr>
+        <w:spacing w:line="360" w:lineRule="auto"/>
+        <w:jc w:val="both"/>
+        <w:rPr>
+          <w:rFonts w:ascii="Times New Roman" w:hAnsi="Times New Roman" w:cs="Times New Roman"/>
+        </w:rPr>
+      </w:pPr>
+      <w:r>
+        <w:rPr>
+          <w:rFonts w:ascii="Times New Roman" w:hAnsi="Times New Roman" w:cs="Times New Roman"/>
+        </w:rPr>
+        <w:t>Uso de tecnología moderna para impresión, diseño gráfico e impresión 3D.</w:t>
+      </w:r>
+    </w:p>
+    <w:p>
+      <w:pPr>
+        <w:pStyle w:val="Prrafodelista"/>
+        <w:numPr>
+          <w:ilvl w:val="0"/>
+          <w:numId w:val="16"/>
+        </w:numPr>
+        <w:spacing w:line="360" w:lineRule="auto"/>
+        <w:jc w:val="both"/>
+        <w:rPr>
+          <w:rFonts w:ascii="Times New Roman" w:hAnsi="Times New Roman" w:cs="Times New Roman"/>
+        </w:rPr>
+      </w:pPr>
+      <w:r>
+        <w:rPr>
+          <w:rFonts w:ascii="Times New Roman" w:hAnsi="Times New Roman" w:cs="Times New Roman"/>
+        </w:rPr>
+        <w:t>Integración de múltiples servicios en un solo establecimiento.</w:t>
+      </w:r>
+    </w:p>
+    <w:p>
+      <w:pPr>
+        <w:pStyle w:val="Prrafodelista"/>
+        <w:numPr>
+          <w:ilvl w:val="0"/>
+          <w:numId w:val="16"/>
+        </w:numPr>
+        <w:spacing w:line="360" w:lineRule="auto"/>
+        <w:jc w:val="both"/>
+        <w:rPr>
+          <w:rFonts w:ascii="Times New Roman" w:hAnsi="Times New Roman" w:cs="Times New Roman"/>
+        </w:rPr>
+      </w:pPr>
+      <w:r>
+        <w:rPr>
+          <w:rFonts w:ascii="Times New Roman" w:hAnsi="Times New Roman" w:cs="Times New Roman"/>
+        </w:rPr>
+        <w:t>Rapidez en tiempos de entrega y atención al cliente.</w:t>
+      </w:r>
+    </w:p>
+    <w:p>
+      <w:pPr>
+        <w:spacing w:line="360" w:lineRule="auto"/>
+        <w:jc w:val="both"/>
+        <w:rPr>
+          <w:rFonts w:ascii="Times New Roman" w:hAnsi="Times New Roman" w:cs="Times New Roman"/>
+        </w:rPr>
+      </w:pPr>
+    </w:p>
+    <w:p>
+      <w:pPr>
+        <w:pStyle w:val="Prrafodelista"/>
+        <w:numPr>
+          <w:ilvl w:val="2"/>
+          <w:numId w:val="3"/>
+        </w:numPr>
+        <w:spacing w:line="360" w:lineRule="auto"/>
+        <w:jc w:val="both"/>
+        <w:rPr>
+          <w:rFonts w:ascii="Times New Roman" w:hAnsi="Times New Roman" w:cs="Times New Roman"/>
+          <w:b/>
+          <w:bCs/>
+        </w:rPr>
+      </w:pPr>
+      <w:r>
+        <w:rPr>
+          <w:rFonts w:ascii="Times New Roman" w:hAnsi="Times New Roman" w:cs="Times New Roman"/>
+          <w:b/>
+          <w:bCs/>
+        </w:rPr>
+        <w:t>Oportunidades</w:t>
+      </w:r>
+    </w:p>
+    <w:p>
+      <w:pPr>
+        <w:pStyle w:val="Prrafodelista"/>
+        <w:numPr>
+          <w:ilvl w:val="0"/>
+          <w:numId w:val="17"/>
+        </w:numPr>
+        <w:spacing w:line="360" w:lineRule="auto"/>
+        <w:jc w:val="both"/>
+        <w:rPr>
+          <w:rFonts w:ascii="Times New Roman" w:hAnsi="Times New Roman" w:cs="Times New Roman"/>
+        </w:rPr>
+      </w:pPr>
+      <w:r>
+        <w:rPr>
+          <w:rFonts w:ascii="Times New Roman" w:hAnsi="Times New Roman" w:cs="Times New Roman"/>
+        </w:rPr>
+        <w:t>Crecimiento de la demanda de servicios de marketing visual y publicidad digital.</w:t>
+      </w:r>
+    </w:p>
+    <w:p>
+      <w:pPr>
+        <w:pStyle w:val="Prrafodelista"/>
+        <w:numPr>
+          <w:ilvl w:val="0"/>
+          <w:numId w:val="17"/>
+        </w:numPr>
+        <w:spacing w:line="360" w:lineRule="auto"/>
+        <w:jc w:val="both"/>
+        <w:rPr>
+          <w:rFonts w:ascii="Times New Roman" w:hAnsi="Times New Roman" w:cs="Times New Roman"/>
+        </w:rPr>
+      </w:pPr>
+      <w:r>
+        <w:rPr>
+          <w:rFonts w:ascii="Times New Roman" w:hAnsi="Times New Roman" w:cs="Times New Roman"/>
+        </w:rPr>
+        <w:t>Posibilidad de expansión hacia servicios digitales como administración de redes sociales y diseño web.</w:t>
+      </w:r>
+    </w:p>
+    <w:p>
+      <w:pPr>
+        <w:pStyle w:val="Prrafodelista"/>
+        <w:numPr>
+          <w:ilvl w:val="0"/>
+          <w:numId w:val="17"/>
+        </w:numPr>
+        <w:spacing w:line="360" w:lineRule="auto"/>
+        <w:jc w:val="both"/>
+        <w:rPr>
+          <w:rFonts w:ascii="Times New Roman" w:hAnsi="Times New Roman" w:cs="Times New Roman"/>
+        </w:rPr>
+      </w:pPr>
+      <w:r>
+        <w:rPr>
+          <w:rFonts w:ascii="Times New Roman" w:hAnsi="Times New Roman" w:cs="Times New Roman"/>
+        </w:rPr>
+        <w:t>Establecimiento de convenios y alianzas con instituciones educativas y pequeños negocios.</w:t>
+      </w:r>
+    </w:p>
+    <w:p>
+      <w:pPr>
+        <w:pStyle w:val="Prrafodelista"/>
+        <w:numPr>
+          <w:ilvl w:val="0"/>
+          <w:numId w:val="17"/>
+        </w:numPr>
+        <w:spacing w:line="360" w:lineRule="auto"/>
+        <w:jc w:val="both"/>
+        <w:rPr>
+          <w:rFonts w:ascii="Times New Roman" w:hAnsi="Times New Roman" w:cs="Times New Roman"/>
+        </w:rPr>
+      </w:pPr>
+      <w:r>
+        <w:rPr>
+          <w:rFonts w:ascii="Times New Roman" w:hAnsi="Times New Roman" w:cs="Times New Roman"/>
+        </w:rPr>
+        <w:t>Aprovechamiento de plataformas digitales y redes sociales para promoción y captación de clientes.</w:t>
+      </w:r>
+    </w:p>
+    <w:p>
+      <w:pPr>
+        <w:pStyle w:val="Prrafodelista"/>
+        <w:numPr>
+          <w:ilvl w:val="0"/>
+          <w:numId w:val="17"/>
+        </w:numPr>
+        <w:spacing w:line="360" w:lineRule="auto"/>
+        <w:jc w:val="both"/>
+        <w:rPr>
+          <w:rFonts w:ascii="Times New Roman" w:hAnsi="Times New Roman" w:cs="Times New Roman"/>
+        </w:rPr>
+      </w:pPr>
+      <w:r>
+        <w:rPr>
+          <w:rFonts w:ascii="Times New Roman" w:hAnsi="Times New Roman" w:cs="Times New Roman"/>
+        </w:rPr>
+        <w:t>Incremento del interés en impresión personalizada y productos creativos.</w:t>
+      </w:r>
+    </w:p>
+    <w:p>
+      <w:pPr>
+        <w:spacing w:line="360" w:lineRule="auto"/>
+        <w:jc w:val="both"/>
+        <w:rPr>
+          <w:rFonts w:ascii="Times New Roman" w:hAnsi="Times New Roman" w:cs="Times New Roman"/>
+        </w:rPr>
+      </w:pPr>
+    </w:p>
+    <w:p>
+      <w:pPr>
+        <w:pStyle w:val="Prrafodelista"/>
+        <w:numPr>
+          <w:ilvl w:val="2"/>
+          <w:numId w:val="3"/>
+        </w:numPr>
+        <w:spacing w:line="360" w:lineRule="auto"/>
+        <w:jc w:val="both"/>
+        <w:rPr>
+          <w:rFonts w:ascii="Times New Roman" w:hAnsi="Times New Roman" w:cs="Times New Roman"/>
+          <w:b/>
+          <w:bCs/>
+        </w:rPr>
+      </w:pPr>
+      <w:r>
+        <w:rPr>
+          <w:rFonts w:ascii="Times New Roman" w:hAnsi="Times New Roman" w:cs="Times New Roman"/>
+          <w:b/>
+          <w:bCs/>
+        </w:rPr>
+        <w:t>Debilidades</w:t>
+      </w:r>
+    </w:p>
+    <w:p>
+      <w:pPr>
+        <w:pStyle w:val="Prrafodelista"/>
+        <w:numPr>
+          <w:ilvl w:val="0"/>
+          <w:numId w:val="18"/>
+        </w:numPr>
+        <w:spacing w:line="360" w:lineRule="auto"/>
+        <w:jc w:val="both"/>
+        <w:rPr>
+          <w:rFonts w:ascii="Times New Roman" w:hAnsi="Times New Roman" w:cs="Times New Roman"/>
+        </w:rPr>
+      </w:pPr>
+      <w:r>
+        <w:rPr>
+          <w:rFonts w:ascii="Times New Roman" w:hAnsi="Times New Roman" w:cs="Times New Roman"/>
+        </w:rPr>
+        <w:t>Dependencia significativa del mercado local y estudiantil.</w:t>
+      </w:r>
+    </w:p>
+    <w:p>
+      <w:pPr>
+        <w:pStyle w:val="Prrafodelista"/>
+        <w:numPr>
+          <w:ilvl w:val="0"/>
+          <w:numId w:val="18"/>
+        </w:numPr>
+        <w:spacing w:line="360" w:lineRule="auto"/>
+        <w:jc w:val="both"/>
+        <w:rPr>
+          <w:rFonts w:ascii="Times New Roman" w:hAnsi="Times New Roman" w:cs="Times New Roman"/>
+        </w:rPr>
+      </w:pPr>
+      <w:r>
+        <w:rPr>
+          <w:rFonts w:ascii="Times New Roman" w:hAnsi="Times New Roman" w:cs="Times New Roman"/>
+        </w:rPr>
+        <w:t>Altos costos de mantenimiento, actualización y reposición de equipos especializados.</w:t>
+      </w:r>
+    </w:p>
+    <w:p>
+      <w:pPr>
+        <w:pStyle w:val="Prrafodelista"/>
+        <w:numPr>
+          <w:ilvl w:val="0"/>
+          <w:numId w:val="18"/>
+        </w:numPr>
+        <w:spacing w:line="360" w:lineRule="auto"/>
+        <w:jc w:val="both"/>
+        <w:rPr>
+          <w:rFonts w:ascii="Times New Roman" w:hAnsi="Times New Roman" w:cs="Times New Roman"/>
+        </w:rPr>
+      </w:pPr>
+      <w:r>
+        <w:rPr>
+          <w:rFonts w:ascii="Times New Roman" w:hAnsi="Times New Roman" w:cs="Times New Roman"/>
+        </w:rPr>
+        <w:t>Procesos internos con bajo nivel de automatización.</w:t>
+      </w:r>
+    </w:p>
+    <w:p>
+      <w:pPr>
+        <w:pStyle w:val="Prrafodelista"/>
+        <w:numPr>
+          <w:ilvl w:val="0"/>
+          <w:numId w:val="18"/>
+        </w:numPr>
+        <w:spacing w:line="360" w:lineRule="auto"/>
+        <w:jc w:val="both"/>
+        <w:rPr>
+          <w:rFonts w:ascii="Times New Roman" w:hAnsi="Times New Roman" w:cs="Times New Roman"/>
+        </w:rPr>
+      </w:pPr>
+      <w:r>
+        <w:rPr>
+          <w:rFonts w:ascii="Times New Roman" w:hAnsi="Times New Roman" w:cs="Times New Roman"/>
+        </w:rPr>
+        <w:t>Limitada disponibilidad de personal especializado en tecnologías emergentes.</w:t>
+      </w:r>
+    </w:p>
+    <w:p>
+      <w:pPr>
+        <w:pStyle w:val="Prrafodelista"/>
+        <w:numPr>
+          <w:ilvl w:val="0"/>
+          <w:numId w:val="18"/>
+        </w:numPr>
+        <w:spacing w:line="360" w:lineRule="auto"/>
+        <w:jc w:val="both"/>
+        <w:rPr>
+          <w:rFonts w:ascii="Times New Roman" w:hAnsi="Times New Roman" w:cs="Times New Roman"/>
+        </w:rPr>
+      </w:pPr>
+      <w:r>
+        <w:rPr>
+          <w:rFonts w:ascii="Times New Roman" w:hAnsi="Times New Roman" w:cs="Times New Roman"/>
+        </w:rPr>
+        <w:lastRenderedPageBreak/>
+        <w:t>Disminución de ventas durante periodos vacacionales o de baja actividad escolar.</w:t>
+      </w:r>
+    </w:p>
+    <w:p>
+      <w:pPr>
+        <w:pStyle w:val="Prrafodelista"/>
+        <w:numPr>
+          <w:ilvl w:val="0"/>
+          <w:numId w:val="18"/>
+        </w:numPr>
+        <w:spacing w:line="360" w:lineRule="auto"/>
+        <w:jc w:val="both"/>
+        <w:rPr>
+          <w:rFonts w:ascii="Times New Roman" w:hAnsi="Times New Roman" w:cs="Times New Roman"/>
+        </w:rPr>
+      </w:pPr>
+      <w:r>
+        <w:rPr>
+          <w:rFonts w:ascii="Times New Roman" w:hAnsi="Times New Roman" w:cs="Times New Roman"/>
+        </w:rPr>
+        <w:t>Dependencia inicial de una inversión tecnológica considerable.</w:t>
+      </w:r>
+    </w:p>
+    <w:p>
+      <w:pPr>
+        <w:spacing w:line="360" w:lineRule="auto"/>
+        <w:jc w:val="both"/>
+        <w:rPr>
+          <w:rFonts w:ascii="Times New Roman" w:hAnsi="Times New Roman" w:cs="Times New Roman"/>
+        </w:rPr>
+      </w:pPr>
+    </w:p>
+    <w:p>
+      <w:pPr>
+        <w:pStyle w:val="Prrafodelista"/>
+        <w:numPr>
+          <w:ilvl w:val="2"/>
+          <w:numId w:val="3"/>
+        </w:numPr>
+        <w:spacing w:line="360" w:lineRule="auto"/>
+        <w:jc w:val="both"/>
+        <w:rPr>
+          <w:rFonts w:ascii="Times New Roman" w:hAnsi="Times New Roman" w:cs="Times New Roman"/>
+          <w:b/>
+          <w:bCs/>
+        </w:rPr>
+      </w:pPr>
+      <w:r>
+        <w:rPr>
+          <w:rFonts w:ascii="Times New Roman" w:hAnsi="Times New Roman" w:cs="Times New Roman"/>
+          <w:b/>
+          <w:bCs/>
+        </w:rPr>
+        <w:t>Amenazas</w:t>
+      </w:r>
+    </w:p>
+    <w:p>
+      <w:pPr>
+        <w:pStyle w:val="Prrafodelista"/>
+        <w:numPr>
+          <w:ilvl w:val="0"/>
+          <w:numId w:val="19"/>
+        </w:numPr>
+        <w:spacing w:line="360" w:lineRule="auto"/>
+        <w:jc w:val="both"/>
+        <w:rPr>
+          <w:rFonts w:ascii="Times New Roman" w:hAnsi="Times New Roman" w:cs="Times New Roman"/>
+        </w:rPr>
+      </w:pPr>
+      <w:r>
+        <w:rPr>
+          <w:rFonts w:ascii="Times New Roman" w:hAnsi="Times New Roman" w:cs="Times New Roman"/>
+        </w:rPr>
+        <w:t>Competencia creciente con imprentas digitales y plataformas de servicios en línea.</w:t>
+      </w:r>
+    </w:p>
+    <w:p>
+      <w:pPr>
+        <w:pStyle w:val="Prrafodelista"/>
+        <w:numPr>
+          <w:ilvl w:val="0"/>
+          <w:numId w:val="19"/>
+        </w:numPr>
+        <w:spacing w:line="360" w:lineRule="auto"/>
+        <w:jc w:val="both"/>
+        <w:rPr>
+          <w:rFonts w:ascii="Times New Roman" w:hAnsi="Times New Roman" w:cs="Times New Roman"/>
+        </w:rPr>
+      </w:pPr>
+      <w:r>
+        <w:rPr>
+          <w:rFonts w:ascii="Times New Roman" w:hAnsi="Times New Roman" w:cs="Times New Roman"/>
+        </w:rPr>
+        <w:t>Necesidad constante de actualización tecnológica para mantenerse competitivo.</w:t>
+      </w:r>
+    </w:p>
+    <w:p>
+      <w:pPr>
+        <w:pStyle w:val="Prrafodelista"/>
+        <w:numPr>
+          <w:ilvl w:val="0"/>
+          <w:numId w:val="19"/>
+        </w:numPr>
+        <w:spacing w:line="360" w:lineRule="auto"/>
+        <w:jc w:val="both"/>
+        <w:rPr>
+          <w:rFonts w:ascii="Times New Roman" w:hAnsi="Times New Roman" w:cs="Times New Roman"/>
+        </w:rPr>
+      </w:pPr>
+      <w:r>
+        <w:rPr>
+          <w:rFonts w:ascii="Times New Roman" w:hAnsi="Times New Roman" w:cs="Times New Roman"/>
+        </w:rPr>
+        <w:t>Variación en los precios de materias primas e insumos de impresión.</w:t>
+      </w:r>
+    </w:p>
+    <w:p>
+      <w:pPr>
+        <w:pStyle w:val="Prrafodelista"/>
+        <w:numPr>
+          <w:ilvl w:val="0"/>
+          <w:numId w:val="19"/>
+        </w:numPr>
+        <w:spacing w:line="360" w:lineRule="auto"/>
+        <w:jc w:val="both"/>
+        <w:rPr>
+          <w:rFonts w:ascii="Times New Roman" w:hAnsi="Times New Roman" w:cs="Times New Roman"/>
+        </w:rPr>
+      </w:pPr>
+      <w:r>
+        <w:rPr>
+          <w:rFonts w:ascii="Times New Roman" w:hAnsi="Times New Roman" w:cs="Times New Roman"/>
+        </w:rPr>
+        <w:t>Reducción progresiva de la demanda de impresión física debido a la digitalización.</w:t>
+      </w:r>
+    </w:p>
+    <w:p>
+      <w:pPr>
+        <w:pStyle w:val="Prrafodelista"/>
+        <w:numPr>
+          <w:ilvl w:val="0"/>
+          <w:numId w:val="19"/>
+        </w:numPr>
+        <w:spacing w:line="360" w:lineRule="auto"/>
+        <w:jc w:val="both"/>
+        <w:rPr>
+          <w:rFonts w:ascii="Times New Roman" w:hAnsi="Times New Roman" w:cs="Times New Roman"/>
+        </w:rPr>
+      </w:pPr>
+      <w:r>
+        <w:rPr>
+          <w:rFonts w:ascii="Times New Roman" w:hAnsi="Times New Roman" w:cs="Times New Roman"/>
+        </w:rPr>
+        <w:t>Riesgo de saturación del mercado local por nuevos emprendimientos similares.</w:t>
+      </w:r>
+    </w:p>
+    <w:p>
+      <w:pPr>
+        <w:spacing w:line="360" w:lineRule="auto"/>
+        <w:jc w:val="both"/>
+        <w:rPr>
+          <w:rFonts w:ascii="Times New Roman" w:hAnsi="Times New Roman" w:cs="Times New Roman"/>
+        </w:rPr>
+      </w:pPr>
+      <w:r>
+        <w:rPr>
+          <w:rFonts w:ascii="Times New Roman" w:hAnsi="Times New Roman" w:cs="Times New Roman"/>
+        </w:rPr>
+        <w:t>Este análisis muestra que la empresa cuenta con fortalezas importantes relacionadas con su ubicación estratégica, diversidad de servicios y uso de tecnología moderna, lo cual permite diferenciarse dentro del mercado local.</w:t>
+      </w:r>
+    </w:p>
+    <w:p>
+      <w:pPr>
+        <w:spacing w:line="360" w:lineRule="auto"/>
+        <w:jc w:val="both"/>
+        <w:rPr>
+          <w:rFonts w:ascii="Times New Roman" w:hAnsi="Times New Roman" w:cs="Times New Roman"/>
+        </w:rPr>
+      </w:pPr>
+      <w:r>
+        <w:rPr>
+          <w:rFonts w:ascii="Times New Roman" w:hAnsi="Times New Roman" w:cs="Times New Roman"/>
+        </w:rPr>
+        <w:t>Sin embargo, el proyecto también presenta desafíos asociados a la dependencia del mercado estudiantil, los costos de actualización tecnológica y la competencia creciente dentro del sector de impresión y diseño gráfico</w:t>
+      </w:r>
+      <w:r>
+        <w:rPr>
+          <w:rFonts w:ascii="Times New Roman" w:hAnsi="Times New Roman" w:cs="Times New Roman"/>
+        </w:rPr>
+        <w:t>.</w:t>
+      </w:r>
+    </w:p>
     <w:sectPr>
       <w:pgSz w:w="12240" w:h="15840"/>
       <w:pgMar w:top="1440" w:right="1440" w:bottom="1440" w:left="1440" w:header="708" w:footer="708" w:gutter="0"/>
@@ -13196,6 +13902,119 @@
     </w:lvl>
   </w:abstractNum>
   <w:abstractNum w:abstractNumId="3" w15:restartNumberingAfterBreak="0">
+    <w:nsid w:val="0C566F94"/>
+    <w:multiLevelType w:val="hybridMultilevel"/>
+    <w:tmpl w:val="C1BE26D8"/>
+    <w:lvl w:ilvl="0" w:tplc="080A0001">
+      <w:start w:val="1"/>
+      <w:numFmt w:val="bullet"/>
+      <w:lvlText w:val=""/>
+      <w:lvlJc w:val="left"/>
+      <w:pPr>
+        <w:ind w:left="1080" w:hanging="360"/>
+      </w:pPr>
+      <w:rPr>
+        <w:rFonts w:ascii="Symbol" w:hAnsi="Symbol" w:hint="default"/>
+      </w:rPr>
+    </w:lvl>
+    <w:lvl w:ilvl="1" w:tplc="080A0003" w:tentative="1">
+      <w:start w:val="1"/>
+      <w:numFmt w:val="bullet"/>
+      <w:lvlText w:val="o"/>
+      <w:lvlJc w:val="left"/>
+      <w:pPr>
+        <w:ind w:left="1800" w:hanging="360"/>
+      </w:pPr>
+      <w:rPr>
+        <w:rFonts w:ascii="Courier New" w:hAnsi="Courier New" w:cs="Courier New" w:hint="default"/>
+      </w:rPr>
+    </w:lvl>
+    <w:lvl w:ilvl="2" w:tplc="080A0005" w:tentative="1">
+      <w:start w:val="1"/>
+      <w:numFmt w:val="bullet"/>
+      <w:lvlText w:val=""/>
+      <w:lvlJc w:val="left"/>
+      <w:pPr>
+        <w:ind w:left="2520" w:hanging="360"/>
+      </w:pPr>
+      <w:rPr>
+        <w:rFonts w:ascii="Wingdings" w:hAnsi="Wingdings" w:hint="default"/>
+      </w:rPr>
+    </w:lvl>
+    <w:lvl w:ilvl="3" w:tplc="080A0001" w:tentative="1">
+      <w:start w:val="1"/>
+      <w:numFmt w:val="bullet"/>
+      <w:lvlText w:val=""/>
+      <w:lvlJc w:val="left"/>
+      <w:pPr>
+        <w:ind w:left="3240" w:hanging="360"/>
+      </w:pPr>
+      <w:rPr>
+        <w:rFonts w:ascii="Symbol" w:hAnsi="Symbol" w:hint="default"/>
+      </w:rPr>
+    </w:lvl>
+    <w:lvl w:ilvl="4" w:tplc="080A0003" w:tentative="1">
+      <w:start w:val="1"/>
+      <w:numFmt w:val="bullet"/>
+      <w:lvlText w:val="o"/>
+      <w:lvlJc w:val="left"/>
+      <w:pPr>
+        <w:ind w:left="3960" w:hanging="360"/>
+      </w:pPr>
+      <w:rPr>
+        <w:rFonts w:ascii="Courier New" w:hAnsi="Courier New" w:cs="Courier New" w:hint="default"/>
+      </w:rPr>
+    </w:lvl>
+    <w:lvl w:ilvl="5" w:tplc="080A0005" w:tentative="1">
+      <w:start w:val="1"/>
+      <w:numFmt w:val="bullet"/>
+      <w:lvlText w:val=""/>
+      <w:lvlJc w:val="left"/>
+      <w:pPr>
+        <w:ind w:left="4680" w:hanging="360"/>
+      </w:pPr>
+      <w:rPr>
+        <w:rFonts w:ascii="Wingdings" w:hAnsi="Wingdings" w:hint="default"/>
+      </w:rPr>
+    </w:lvl>
+    <w:lvl w:ilvl="6" w:tplc="080A0001" w:tentative="1">
+      <w:start w:val="1"/>
+      <w:numFmt w:val="bullet"/>
+      <w:lvlText w:val=""/>
+      <w:lvlJc w:val="left"/>
+      <w:pPr>
+        <w:ind w:left="5400" w:hanging="360"/>
+      </w:pPr>
+      <w:rPr>
+        <w:rFonts w:ascii="Symbol" w:hAnsi="Symbol" w:hint="default"/>
+      </w:rPr>
+    </w:lvl>
+    <w:lvl w:ilvl="7" w:tplc="080A0003" w:tentative="1">
+      <w:start w:val="1"/>
+      <w:numFmt w:val="bullet"/>
+      <w:lvlText w:val="o"/>
+      <w:lvlJc w:val="left"/>
+      <w:pPr>
+        <w:ind w:left="6120" w:hanging="360"/>
+      </w:pPr>
+      <w:rPr>
+        <w:rFonts w:ascii="Courier New" w:hAnsi="Courier New" w:cs="Courier New" w:hint="default"/>
+      </w:rPr>
+    </w:lvl>
+    <w:lvl w:ilvl="8" w:tplc="080A0005" w:tentative="1">
+      <w:start w:val="1"/>
+      <w:numFmt w:val="bullet"/>
+      <w:lvlText w:val=""/>
+      <w:lvlJc w:val="left"/>
+      <w:pPr>
+        <w:ind w:left="6840" w:hanging="360"/>
+      </w:pPr>
+      <w:rPr>
+        <w:rFonts w:ascii="Wingdings" w:hAnsi="Wingdings" w:hint="default"/>
+      </w:rPr>
+    </w:lvl>
+  </w:abstractNum>
+  <w:abstractNum w:abstractNumId="4" w15:restartNumberingAfterBreak="0">
     <w:nsid w:val="181522BB"/>
     <w:multiLevelType w:val="hybridMultilevel"/>
     <w:tmpl w:val="5CB2B296"/>
@@ -13284,7 +14103,120 @@
       </w:pPr>
     </w:lvl>
   </w:abstractNum>
-  <w:abstractNum w:abstractNumId="4" w15:restartNumberingAfterBreak="0">
+  <w:abstractNum w:abstractNumId="5" w15:restartNumberingAfterBreak="0">
+    <w:nsid w:val="212D054E"/>
+    <w:multiLevelType w:val="hybridMultilevel"/>
+    <w:tmpl w:val="4642BC72"/>
+    <w:lvl w:ilvl="0" w:tplc="080A0001">
+      <w:start w:val="1"/>
+      <w:numFmt w:val="bullet"/>
+      <w:lvlText w:val=""/>
+      <w:lvlJc w:val="left"/>
+      <w:pPr>
+        <w:ind w:left="1080" w:hanging="360"/>
+      </w:pPr>
+      <w:rPr>
+        <w:rFonts w:ascii="Symbol" w:hAnsi="Symbol" w:hint="default"/>
+      </w:rPr>
+    </w:lvl>
+    <w:lvl w:ilvl="1" w:tplc="080A0003" w:tentative="1">
+      <w:start w:val="1"/>
+      <w:numFmt w:val="bullet"/>
+      <w:lvlText w:val="o"/>
+      <w:lvlJc w:val="left"/>
+      <w:pPr>
+        <w:ind w:left="1800" w:hanging="360"/>
+      </w:pPr>
+      <w:rPr>
+        <w:rFonts w:ascii="Courier New" w:hAnsi="Courier New" w:cs="Courier New" w:hint="default"/>
+      </w:rPr>
+    </w:lvl>
+    <w:lvl w:ilvl="2" w:tplc="080A0005" w:tentative="1">
+      <w:start w:val="1"/>
+      <w:numFmt w:val="bullet"/>
+      <w:lvlText w:val=""/>
+      <w:lvlJc w:val="left"/>
+      <w:pPr>
+        <w:ind w:left="2520" w:hanging="360"/>
+      </w:pPr>
+      <w:rPr>
+        <w:rFonts w:ascii="Wingdings" w:hAnsi="Wingdings" w:hint="default"/>
+      </w:rPr>
+    </w:lvl>
+    <w:lvl w:ilvl="3" w:tplc="080A0001" w:tentative="1">
+      <w:start w:val="1"/>
+      <w:numFmt w:val="bullet"/>
+      <w:lvlText w:val=""/>
+      <w:lvlJc w:val="left"/>
+      <w:pPr>
+        <w:ind w:left="3240" w:hanging="360"/>
+      </w:pPr>
+      <w:rPr>
+        <w:rFonts w:ascii="Symbol" w:hAnsi="Symbol" w:hint="default"/>
+      </w:rPr>
+    </w:lvl>
+    <w:lvl w:ilvl="4" w:tplc="080A0003" w:tentative="1">
+      <w:start w:val="1"/>
+      <w:numFmt w:val="bullet"/>
+      <w:lvlText w:val="o"/>
+      <w:lvlJc w:val="left"/>
+      <w:pPr>
+        <w:ind w:left="3960" w:hanging="360"/>
+      </w:pPr>
+      <w:rPr>
+        <w:rFonts w:ascii="Courier New" w:hAnsi="Courier New" w:cs="Courier New" w:hint="default"/>
+      </w:rPr>
+    </w:lvl>
+    <w:lvl w:ilvl="5" w:tplc="080A0005" w:tentative="1">
+      <w:start w:val="1"/>
+      <w:numFmt w:val="bullet"/>
+      <w:lvlText w:val=""/>
+      <w:lvlJc w:val="left"/>
+      <w:pPr>
+        <w:ind w:left="4680" w:hanging="360"/>
+      </w:pPr>
+      <w:rPr>
+        <w:rFonts w:ascii="Wingdings" w:hAnsi="Wingdings" w:hint="default"/>
+      </w:rPr>
+    </w:lvl>
+    <w:lvl w:ilvl="6" w:tplc="080A0001" w:tentative="1">
+      <w:start w:val="1"/>
+      <w:numFmt w:val="bullet"/>
+      <w:lvlText w:val=""/>
+      <w:lvlJc w:val="left"/>
+      <w:pPr>
+        <w:ind w:left="5400" w:hanging="360"/>
+      </w:pPr>
+      <w:rPr>
+        <w:rFonts w:ascii="Symbol" w:hAnsi="Symbol" w:hint="default"/>
+      </w:rPr>
+    </w:lvl>
+    <w:lvl w:ilvl="7" w:tplc="080A0003" w:tentative="1">
+      <w:start w:val="1"/>
+      <w:numFmt w:val="bullet"/>
+      <w:lvlText w:val="o"/>
+      <w:lvlJc w:val="left"/>
+      <w:pPr>
+        <w:ind w:left="6120" w:hanging="360"/>
+      </w:pPr>
+      <w:rPr>
+        <w:rFonts w:ascii="Courier New" w:hAnsi="Courier New" w:cs="Courier New" w:hint="default"/>
+      </w:rPr>
+    </w:lvl>
+    <w:lvl w:ilvl="8" w:tplc="080A0005" w:tentative="1">
+      <w:start w:val="1"/>
+      <w:numFmt w:val="bullet"/>
+      <w:lvlText w:val=""/>
+      <w:lvlJc w:val="left"/>
+      <w:pPr>
+        <w:ind w:left="6840" w:hanging="360"/>
+      </w:pPr>
+      <w:rPr>
+        <w:rFonts w:ascii="Wingdings" w:hAnsi="Wingdings" w:hint="default"/>
+      </w:rPr>
+    </w:lvl>
+  </w:abstractNum>
+  <w:abstractNum w:abstractNumId="6" w15:restartNumberingAfterBreak="0">
     <w:nsid w:val="218A65E7"/>
     <w:multiLevelType w:val="hybridMultilevel"/>
     <w:tmpl w:val="1C44A830"/>
@@ -13397,7 +14329,7 @@
       </w:rPr>
     </w:lvl>
   </w:abstractNum>
-  <w:abstractNum w:abstractNumId="5" w15:restartNumberingAfterBreak="0">
+  <w:abstractNum w:abstractNumId="7" w15:restartNumberingAfterBreak="0">
     <w:nsid w:val="22821A80"/>
     <w:multiLevelType w:val="hybridMultilevel"/>
     <w:tmpl w:val="C136CD78"/>
@@ -13510,7 +14442,7 @@
       </w:rPr>
     </w:lvl>
   </w:abstractNum>
-  <w:abstractNum w:abstractNumId="6" w15:restartNumberingAfterBreak="0">
+  <w:abstractNum w:abstractNumId="8" w15:restartNumberingAfterBreak="0">
     <w:nsid w:val="23C20BDF"/>
     <w:multiLevelType w:val="hybridMultilevel"/>
     <w:tmpl w:val="26C6E910"/>
@@ -13623,7 +14555,7 @@
       </w:rPr>
     </w:lvl>
   </w:abstractNum>
-  <w:abstractNum w:abstractNumId="7" w15:restartNumberingAfterBreak="0">
+  <w:abstractNum w:abstractNumId="9" w15:restartNumberingAfterBreak="0">
     <w:nsid w:val="2A7A3BA6"/>
     <w:multiLevelType w:val="hybridMultilevel"/>
     <w:tmpl w:val="4E0EDB20"/>
@@ -13712,7 +14644,7 @@
       </w:pPr>
     </w:lvl>
   </w:abstractNum>
-  <w:abstractNum w:abstractNumId="8" w15:restartNumberingAfterBreak="0">
+  <w:abstractNum w:abstractNumId="10" w15:restartNumberingAfterBreak="0">
     <w:nsid w:val="37143169"/>
     <w:multiLevelType w:val="hybridMultilevel"/>
     <w:tmpl w:val="867A6E3A"/>
@@ -13825,7 +14757,7 @@
       </w:rPr>
     </w:lvl>
   </w:abstractNum>
-  <w:abstractNum w:abstractNumId="9" w15:restartNumberingAfterBreak="0">
+  <w:abstractNum w:abstractNumId="11" w15:restartNumberingAfterBreak="0">
     <w:nsid w:val="3D437E49"/>
     <w:multiLevelType w:val="multilevel"/>
     <w:tmpl w:val="F9ACF6E2"/>
@@ -13938,7 +14870,7 @@
       </w:rPr>
     </w:lvl>
   </w:abstractNum>
-  <w:abstractNum w:abstractNumId="10" w15:restartNumberingAfterBreak="0">
+  <w:abstractNum w:abstractNumId="12" w15:restartNumberingAfterBreak="0">
     <w:nsid w:val="456A4121"/>
     <w:multiLevelType w:val="multilevel"/>
     <w:tmpl w:val="800497B0"/>
@@ -14059,7 +14991,7 @@
       </w:rPr>
     </w:lvl>
   </w:abstractNum>
-  <w:abstractNum w:abstractNumId="11" w15:restartNumberingAfterBreak="0">
+  <w:abstractNum w:abstractNumId="13" w15:restartNumberingAfterBreak="0">
     <w:nsid w:val="45C4254C"/>
     <w:multiLevelType w:val="multilevel"/>
     <w:tmpl w:val="16D0750C"/>
@@ -14172,10 +15104,10 @@
       </w:rPr>
     </w:lvl>
   </w:abstractNum>
-  <w:abstractNum w:abstractNumId="12" w15:restartNumberingAfterBreak="0">
-    <w:nsid w:val="58D1101C"/>
+  <w:abstractNum w:abstractNumId="14" w15:restartNumberingAfterBreak="0">
+    <w:nsid w:val="57325552"/>
     <w:multiLevelType w:val="hybridMultilevel"/>
-    <w:tmpl w:val="6438569C"/>
+    <w:tmpl w:val="D7927C94"/>
     <w:lvl w:ilvl="0" w:tplc="080A0001">
       <w:start w:val="1"/>
       <w:numFmt w:val="bullet"/>
@@ -14285,10 +15217,10 @@
       </w:rPr>
     </w:lvl>
   </w:abstractNum>
-  <w:abstractNum w:abstractNumId="13" w15:restartNumberingAfterBreak="0">
-    <w:nsid w:val="65CC0AA4"/>
+  <w:abstractNum w:abstractNumId="15" w15:restartNumberingAfterBreak="0">
+    <w:nsid w:val="58D1101C"/>
     <w:multiLevelType w:val="hybridMultilevel"/>
-    <w:tmpl w:val="C18EE5AE"/>
+    <w:tmpl w:val="6438569C"/>
     <w:lvl w:ilvl="0" w:tplc="080A0001">
       <w:start w:val="1"/>
       <w:numFmt w:val="bullet"/>
@@ -14398,7 +15330,233 @@
       </w:rPr>
     </w:lvl>
   </w:abstractNum>
-  <w:abstractNum w:abstractNumId="14" w15:restartNumberingAfterBreak="0">
+  <w:abstractNum w:abstractNumId="16" w15:restartNumberingAfterBreak="0">
+    <w:nsid w:val="65CC0AA4"/>
+    <w:multiLevelType w:val="hybridMultilevel"/>
+    <w:tmpl w:val="C18EE5AE"/>
+    <w:lvl w:ilvl="0" w:tplc="080A0001">
+      <w:start w:val="1"/>
+      <w:numFmt w:val="bullet"/>
+      <w:lvlText w:val=""/>
+      <w:lvlJc w:val="left"/>
+      <w:pPr>
+        <w:ind w:left="1080" w:hanging="360"/>
+      </w:pPr>
+      <w:rPr>
+        <w:rFonts w:ascii="Symbol" w:hAnsi="Symbol" w:hint="default"/>
+      </w:rPr>
+    </w:lvl>
+    <w:lvl w:ilvl="1" w:tplc="080A0003" w:tentative="1">
+      <w:start w:val="1"/>
+      <w:numFmt w:val="bullet"/>
+      <w:lvlText w:val="o"/>
+      <w:lvlJc w:val="left"/>
+      <w:pPr>
+        <w:ind w:left="1800" w:hanging="360"/>
+      </w:pPr>
+      <w:rPr>
+        <w:rFonts w:ascii="Courier New" w:hAnsi="Courier New" w:cs="Courier New" w:hint="default"/>
+      </w:rPr>
+    </w:lvl>
+    <w:lvl w:ilvl="2" w:tplc="080A0005" w:tentative="1">
+      <w:start w:val="1"/>
+      <w:numFmt w:val="bullet"/>
+      <w:lvlText w:val=""/>
+      <w:lvlJc w:val="left"/>
+      <w:pPr>
+        <w:ind w:left="2520" w:hanging="360"/>
+      </w:pPr>
+      <w:rPr>
+        <w:rFonts w:ascii="Wingdings" w:hAnsi="Wingdings" w:hint="default"/>
+      </w:rPr>
+    </w:lvl>
+    <w:lvl w:ilvl="3" w:tplc="080A0001" w:tentative="1">
+      <w:start w:val="1"/>
+      <w:numFmt w:val="bullet"/>
+      <w:lvlText w:val=""/>
+      <w:lvlJc w:val="left"/>
+      <w:pPr>
+        <w:ind w:left="3240" w:hanging="360"/>
+      </w:pPr>
+      <w:rPr>
+        <w:rFonts w:ascii="Symbol" w:hAnsi="Symbol" w:hint="default"/>
+      </w:rPr>
+    </w:lvl>
+    <w:lvl w:ilvl="4" w:tplc="080A0003" w:tentative="1">
+      <w:start w:val="1"/>
+      <w:numFmt w:val="bullet"/>
+      <w:lvlText w:val="o"/>
+      <w:lvlJc w:val="left"/>
+      <w:pPr>
+        <w:ind w:left="3960" w:hanging="360"/>
+      </w:pPr>
+      <w:rPr>
+        <w:rFonts w:ascii="Courier New" w:hAnsi="Courier New" w:cs="Courier New" w:hint="default"/>
+      </w:rPr>
+    </w:lvl>
+    <w:lvl w:ilvl="5" w:tplc="080A0005" w:tentative="1">
+      <w:start w:val="1"/>
+      <w:numFmt w:val="bullet"/>
+      <w:lvlText w:val=""/>
+      <w:lvlJc w:val="left"/>
+      <w:pPr>
+        <w:ind w:left="4680" w:hanging="360"/>
+      </w:pPr>
+      <w:rPr>
+        <w:rFonts w:ascii="Wingdings" w:hAnsi="Wingdings" w:hint="default"/>
+      </w:rPr>
+    </w:lvl>
+    <w:lvl w:ilvl="6" w:tplc="080A0001" w:tentative="1">
+      <w:start w:val="1"/>
+      <w:numFmt w:val="bullet"/>
+      <w:lvlText w:val=""/>
+      <w:lvlJc w:val="left"/>
+      <w:pPr>
+        <w:ind w:left="5400" w:hanging="360"/>
+      </w:pPr>
+      <w:rPr>
+        <w:rFonts w:ascii="Symbol" w:hAnsi="Symbol" w:hint="default"/>
+      </w:rPr>
+    </w:lvl>
+    <w:lvl w:ilvl="7" w:tplc="080A0003" w:tentative="1">
+      <w:start w:val="1"/>
+      <w:numFmt w:val="bullet"/>
+      <w:lvlText w:val="o"/>
+      <w:lvlJc w:val="left"/>
+      <w:pPr>
+        <w:ind w:left="6120" w:hanging="360"/>
+      </w:pPr>
+      <w:rPr>
+        <w:rFonts w:ascii="Courier New" w:hAnsi="Courier New" w:cs="Courier New" w:hint="default"/>
+      </w:rPr>
+    </w:lvl>
+    <w:lvl w:ilvl="8" w:tplc="080A0005" w:tentative="1">
+      <w:start w:val="1"/>
+      <w:numFmt w:val="bullet"/>
+      <w:lvlText w:val=""/>
+      <w:lvlJc w:val="left"/>
+      <w:pPr>
+        <w:ind w:left="6840" w:hanging="360"/>
+      </w:pPr>
+      <w:rPr>
+        <w:rFonts w:ascii="Wingdings" w:hAnsi="Wingdings" w:hint="default"/>
+      </w:rPr>
+    </w:lvl>
+  </w:abstractNum>
+  <w:abstractNum w:abstractNumId="17" w15:restartNumberingAfterBreak="0">
+    <w:nsid w:val="7EF600EB"/>
+    <w:multiLevelType w:val="hybridMultilevel"/>
+    <w:tmpl w:val="F1145652"/>
+    <w:lvl w:ilvl="0" w:tplc="080A0001">
+      <w:start w:val="1"/>
+      <w:numFmt w:val="bullet"/>
+      <w:lvlText w:val=""/>
+      <w:lvlJc w:val="left"/>
+      <w:pPr>
+        <w:ind w:left="1080" w:hanging="360"/>
+      </w:pPr>
+      <w:rPr>
+        <w:rFonts w:ascii="Symbol" w:hAnsi="Symbol" w:hint="default"/>
+      </w:rPr>
+    </w:lvl>
+    <w:lvl w:ilvl="1" w:tplc="080A0003" w:tentative="1">
+      <w:start w:val="1"/>
+      <w:numFmt w:val="bullet"/>
+      <w:lvlText w:val="o"/>
+      <w:lvlJc w:val="left"/>
+      <w:pPr>
+        <w:ind w:left="1800" w:hanging="360"/>
+      </w:pPr>
+      <w:rPr>
+        <w:rFonts w:ascii="Courier New" w:hAnsi="Courier New" w:cs="Courier New" w:hint="default"/>
+      </w:rPr>
+    </w:lvl>
+    <w:lvl w:ilvl="2" w:tplc="080A0005" w:tentative="1">
+      <w:start w:val="1"/>
+      <w:numFmt w:val="bullet"/>
+      <w:lvlText w:val=""/>
+      <w:lvlJc w:val="left"/>
+      <w:pPr>
+        <w:ind w:left="2520" w:hanging="360"/>
+      </w:pPr>
+      <w:rPr>
+        <w:rFonts w:ascii="Wingdings" w:hAnsi="Wingdings" w:hint="default"/>
+      </w:rPr>
+    </w:lvl>
+    <w:lvl w:ilvl="3" w:tplc="080A0001" w:tentative="1">
+      <w:start w:val="1"/>
+      <w:numFmt w:val="bullet"/>
+      <w:lvlText w:val=""/>
+      <w:lvlJc w:val="left"/>
+      <w:pPr>
+        <w:ind w:left="3240" w:hanging="360"/>
+      </w:pPr>
+      <w:rPr>
+        <w:rFonts w:ascii="Symbol" w:hAnsi="Symbol" w:hint="default"/>
+      </w:rPr>
+    </w:lvl>
+    <w:lvl w:ilvl="4" w:tplc="080A0003" w:tentative="1">
+      <w:start w:val="1"/>
+      <w:numFmt w:val="bullet"/>
+      <w:lvlText w:val="o"/>
+      <w:lvlJc w:val="left"/>
+      <w:pPr>
+        <w:ind w:left="3960" w:hanging="360"/>
+      </w:pPr>
+      <w:rPr>
+        <w:rFonts w:ascii="Courier New" w:hAnsi="Courier New" w:cs="Courier New" w:hint="default"/>
+      </w:rPr>
+    </w:lvl>
+    <w:lvl w:ilvl="5" w:tplc="080A0005" w:tentative="1">
+      <w:start w:val="1"/>
+      <w:numFmt w:val="bullet"/>
+      <w:lvlText w:val=""/>
+      <w:lvlJc w:val="left"/>
+      <w:pPr>
+        <w:ind w:left="4680" w:hanging="360"/>
+      </w:pPr>
+      <w:rPr>
+        <w:rFonts w:ascii="Wingdings" w:hAnsi="Wingdings" w:hint="default"/>
+      </w:rPr>
+    </w:lvl>
+    <w:lvl w:ilvl="6" w:tplc="080A0001" w:tentative="1">
+      <w:start w:val="1"/>
+      <w:numFmt w:val="bullet"/>
+      <w:lvlText w:val=""/>
+      <w:lvlJc w:val="left"/>
+      <w:pPr>
+        <w:ind w:left="5400" w:hanging="360"/>
+      </w:pPr>
+      <w:rPr>
+        <w:rFonts w:ascii="Symbol" w:hAnsi="Symbol" w:hint="default"/>
+      </w:rPr>
+    </w:lvl>
+    <w:lvl w:ilvl="7" w:tplc="080A0003" w:tentative="1">
+      <w:start w:val="1"/>
+      <w:numFmt w:val="bullet"/>
+      <w:lvlText w:val="o"/>
+      <w:lvlJc w:val="left"/>
+      <w:pPr>
+        <w:ind w:left="6120" w:hanging="360"/>
+      </w:pPr>
+      <w:rPr>
+        <w:rFonts w:ascii="Courier New" w:hAnsi="Courier New" w:cs="Courier New" w:hint="default"/>
+      </w:rPr>
+    </w:lvl>
+    <w:lvl w:ilvl="8" w:tplc="080A0005" w:tentative="1">
+      <w:start w:val="1"/>
+      <w:numFmt w:val="bullet"/>
+      <w:lvlText w:val=""/>
+      <w:lvlJc w:val="left"/>
+      <w:pPr>
+        <w:ind w:left="6840" w:hanging="360"/>
+      </w:pPr>
+      <w:rPr>
+        <w:rFonts w:ascii="Wingdings" w:hAnsi="Wingdings" w:hint="default"/>
+      </w:rPr>
+    </w:lvl>
+  </w:abstractNum>
+  <w:abstractNum w:abstractNumId="18" w15:restartNumberingAfterBreak="0">
     <w:nsid w:val="7F1C1E9E"/>
     <w:multiLevelType w:val="hybridMultilevel"/>
     <w:tmpl w:val="11EE222A"/>
@@ -14488,49 +15646,61 @@
     </w:lvl>
   </w:abstractNum>
   <w:num w:numId="1" w16cid:durableId="776602524">
-    <w:abstractNumId w:val="5"/>
+    <w:abstractNumId w:val="7"/>
   </w:num>
   <w:num w:numId="2" w16cid:durableId="1416853395">
-    <w:abstractNumId w:val="7"/>
+    <w:abstractNumId w:val="9"/>
   </w:num>
   <w:num w:numId="3" w16cid:durableId="345180104">
-    <w:abstractNumId w:val="10"/>
+    <w:abstractNumId w:val="12"/>
   </w:num>
   <w:num w:numId="4" w16cid:durableId="439646508">
     <w:abstractNumId w:val="2"/>
   </w:num>
   <w:num w:numId="5" w16cid:durableId="96878089">
-    <w:abstractNumId w:val="4"/>
+    <w:abstractNumId w:val="6"/>
   </w:num>
   <w:num w:numId="6" w16cid:durableId="440302596">
     <w:abstractNumId w:val="0"/>
   </w:num>
   <w:num w:numId="7" w16cid:durableId="2134787632">
-    <w:abstractNumId w:val="12"/>
+    <w:abstractNumId w:val="15"/>
   </w:num>
   <w:num w:numId="8" w16cid:durableId="689527085">
-    <w:abstractNumId w:val="13"/>
+    <w:abstractNumId w:val="16"/>
   </w:num>
   <w:num w:numId="9" w16cid:durableId="1510176707">
-    <w:abstractNumId w:val="8"/>
+    <w:abstractNumId w:val="10"/>
   </w:num>
   <w:num w:numId="10" w16cid:durableId="488636865">
     <w:abstractNumId w:val="1"/>
   </w:num>
   <w:num w:numId="11" w16cid:durableId="115415298">
+    <w:abstractNumId w:val="18"/>
+  </w:num>
+  <w:num w:numId="12" w16cid:durableId="939413747">
+    <w:abstractNumId w:val="4"/>
+  </w:num>
+  <w:num w:numId="13" w16cid:durableId="601186567">
+    <w:abstractNumId w:val="8"/>
+  </w:num>
+  <w:num w:numId="14" w16cid:durableId="458453313">
+    <w:abstractNumId w:val="11"/>
+  </w:num>
+  <w:num w:numId="15" w16cid:durableId="900407812">
+    <w:abstractNumId w:val="13"/>
+  </w:num>
+  <w:num w:numId="16" w16cid:durableId="75565780">
+    <w:abstractNumId w:val="5"/>
+  </w:num>
+  <w:num w:numId="17" w16cid:durableId="311256392">
     <w:abstractNumId w:val="14"/>
   </w:num>
-  <w:num w:numId="12" w16cid:durableId="939413747">
+  <w:num w:numId="18" w16cid:durableId="446237583">
     <w:abstractNumId w:val="3"/>
   </w:num>
-  <w:num w:numId="13" w16cid:durableId="601186567">
-    <w:abstractNumId w:val="6"/>
-  </w:num>
-  <w:num w:numId="14" w16cid:durableId="458453313">
-    <w:abstractNumId w:val="9"/>
-  </w:num>
-  <w:num w:numId="15" w16cid:durableId="900407812">
-    <w:abstractNumId w:val="11"/>
+  <w:num w:numId="19" w16cid:durableId="886915509">
+    <w:abstractNumId w:val="17"/>
   </w:num>
 </w:numbering>
 </file>
@@ -15138,6 +16308,7 @@
   <w:style w:type="character" w:default="1" w:styleId="Fuentedeprrafopredeter">
     <w:name w:val="Default Paragraph Font"/>
     <w:uiPriority w:val="1"/>
+    <w:semiHidden/>
     <w:unhideWhenUsed/>
   </w:style>
   <w:style w:type="table" w:default="1" w:styleId="Tablanormal">

</xml_diff>